<commit_message>
Precisa la atribución de las tasas de crecimiento de Kenia
</commit_message>
<xml_diff>
--- a/trabajo_africa/documentos/Trabajo_Kenia_Cristina_Moro_APA.docx
+++ b/trabajo_africa/documentos/Trabajo_Kenia_Cristina_Moro_APA.docx
@@ -46,7 +46,22 @@
     </w:p>
     <w:p>
       <w:r>
-        <w:t>Kenia combina agricultura con comercio, finanzas, transporte y servicios de información. Según KNBS, el PIB real creció un 4,6 % en 2025, frente al 4,7 % de 2024. La agricultura conserva un peso importante en la estructura productiva. La coexistencia de estas actividades diversifica las fuentes de ingreso, aunque la exposición agrícola y la calidad del empleo siguen condicionando el mercado residencial (Central Bank of Kenya, s. f.; Kenya National Bureau of Statistics, 2026).</w:t>
+        <w:rPr>
+          <w:i w:val="0"/>
+        </w:rPr>
+        <w:t xml:space="preserve">Según el </w:t>
+      </w:r>
+      <w:r>
+        <w:rPr>
+          <w:i/>
+        </w:rPr>
+        <w:t>Economic Survey 2026</w:t>
+      </w:r>
+      <w:r>
+        <w:rPr>
+          <w:i w:val="0"/>
+        </w:rPr>
+        <w:t xml:space="preserve"> de KNBS, el PIB real de Kenia creció un 4,6 % en 2025, frente al 4,7 % de 2024. El Banco Central de Kenia reproduce estas cifras en su serie de PIB anual (Central Bank of Kenya, s. f.; Kenya National Bureau of Statistics, 2026). Para valorar las implicaciones de este crecimiento sobre la demanda de alquiler en Nairobi, es necesario estudiar los ingresos y la estabilidad laboral de los hogares destinatarios.</w:t>
       </w:r>
     </w:p>
     <w:p>

</xml_diff>

<commit_message>
Retira la fuente de IFC y los argumentos que dependían de ella
</commit_message>
<xml_diff>
--- a/trabajo_africa/documentos/Trabajo_Kenia_Cristina_Moro_APA.docx
+++ b/trabajo_africa/documentos/Trabajo_Kenia_Cristina_Moro_APA.docx
@@ -28,7 +28,7 @@
     </w:p>
     <w:p>
       <w:r>
-        <w:t>Kenia alcanzó la independencia en 1963 con una economía y unas relaciones de acceso a la tierra marcadas por el dominio colonial. La expansión de la pequeña agricultura y la intervención pública dieron paso, desde los años ochenta, a reformas de liberalización y a una mayor participación privada (Gamba &amp; Kibaara, 2007). El crecimiento posterior de los servicios y la innovación ha convivido con diferencias de acceso al empleo y a las oportunidades. Este trabajo plantea que la construcción de vivienda para alquiler en Nairobi puede atraer inversión y mejorar las condiciones de vida de trabajadores, siempre que el producto sea compatible con sus ingresos y se apoye en suelo jurídicamente seguro, servicios adecuados y contratos previsibles. El marco de instituciones inclusivas y extractivas de Acemoglu y Robinson permitirá examinar quién accede a esas oportunidades y cómo se distribuyen los beneficios. Se elige Acorn Holdings como empresa de cabecera y se compara con IHS y Fusion Capital.</w:t>
+        <w:t>Kenia alcanzó la independencia en 1963 con una economía y unas relaciones de acceso a la tierra marcadas por el dominio colonial. La expansión de la pequeña agricultura y la intervención pública dieron paso, desde los años ochenta, a reformas de liberalización y a una mayor participación privada (Gamba &amp; Kibaara, 2007). El crecimiento posterior de los servicios y la innovación ha convivido con diferencias de acceso al empleo y a las oportunidades. Este trabajo plantea que la construcción de vivienda para alquiler en Nairobi puede atraer inversión y mejorar las condiciones de vida de trabajadores, siempre que el producto sea compatible con sus ingresos y se apoye en suelo jurídicamente seguro, servicios adecuados y contratos previsibles. El marco de instituciones inclusivas y extractivas de Acemoglu y Robinson permitirá examinar quién accede a esas oportunidades y cómo se distribuyen los beneficios. Se elige Acorn Holdings como empresa de cabecera y se compara con Fusion Capital.</w:t>
       </w:r>
     </w:p>
     <w:p>
@@ -104,11 +104,6 @@
     </w:p>
     <w:p>
       <w:r>
-        <w:t>Otro activo es la existencia de organizaciones capaces de desarrollar y gestionar vivienda con inversión institucional. La ficha de IFC sobre IHS describe desarrollo y adquisición de vivienda en Nairobi y otras zonas urbanas, con criterios de eficiencia de recursos y colaboración con promotores. Este precedente muestra una vía para organizar capital destinado a vivienda. Una nueva operación necesitaría justificar su demanda, sus costes y la modalidad de tenencia (International Finance Corporation, 2024).</w:t>
-      </w:r>
-    </w:p>
-    <w:p>
-      <w:r>
         <w:t xml:space="preserve">El contexto de inversión debe distinguir flujos anuales y capital acumulado. La ficha keniana del </w:t>
       </w:r>
       <w:r>
@@ -123,7 +118,7 @@
     </w:p>
     <w:p>
       <w:r>
-        <w:t>La iniciativa de Acorn para ampliar el alquiler y el programa de IHS muestran precedentes de organización institucional de capital. Su desarrollo es una oportunidad condicionada por demanda y ejecución, no una promesa automática de financiación del proyecto (Private Infrastructure Development Group, 2025).</w:t>
+        <w:t>La iniciativa de Acorn para ampliar el alquiler muestra un precedente de organización institucional de capital. Su desarrollo es una oportunidad condicionada por demanda y ejecución, no una promesa automática de financiación del proyecto (Private Infrastructure Development Group, 2025).</w:t>
       </w:r>
     </w:p>
     <w:p>
@@ -538,7 +533,7 @@
               <w:rPr>
                 <w:sz w:val="20"/>
               </w:rPr>
-              <w:t xml:space="preserve"> integración regional y posibilidades de captar capital de largo plazo, ilustradas por el programa de IHS y la iniciativa de Acorn. Su aprovechamiento exige convertir los marcos y compromisos en proyectos ejecutables (§§ 2–3).</w:t>
+              <w:t xml:space="preserve"> integración regional y posibilidades de captar capital de largo plazo, ilustradas por la iniciativa de Acorn. Su aprovechamiento exige convertir los marcos y compromisos en proyectos ejecutables (§§ 2–3).</w:t>
             </w:r>
           </w:p>
         </w:tc>
@@ -676,7 +671,7 @@
     </w:p>
     <w:p>
       <w:r>
-        <w:t>Frente a estudiar una nueva implantación en Kampala o Kigali, se prioriza aprovechar las capacidades kenianas ya documentadas de Acorn e IHS. Esta elección reduce el número de capacidades que habría que construir desde cero y permite concentrar el análisis en producto y clientes. Es una ventaja de ejecución propuesta, no una superioridad demostrada de Nairobi en rentabilidad o costes.</w:t>
+        <w:t>Frente a estudiar una nueva implantación en Kampala o Kigali, se prioriza aprovechar las capacidades kenianas ya documentadas de Acorn. Esta elección reduce el número de capacidades que habría que construir desde cero y permite concentrar el análisis en producto y clientes. Es una ventaja de ejecución propuesta, no una superioridad demostrada de Nairobi en rentabilidad o costes.</w:t>
       </w:r>
     </w:p>
     <w:p>
@@ -723,21 +718,10 @@
         <w:rPr>
           <w:b/>
         </w:rPr>
-        <w:t>International Housing Solutions (IHS)</w:t>
-      </w:r>
-      <w:r>
-        <w:t xml:space="preserve"> es una segunda empresa objetivo por su experiencia en fondos de vivienda y su programa keniano. La documentación de IFC contempla alquiler, venta y alquiler con opción de compra; por ello, habría que acordar expresamente una operación destinada a alquiler permanente. Se estudiaría como alternativa para captar y gestionar capital, sin presumir que dispone de fondos comprometidos para esta promoción (International Finance Corporation, 2024).</w:t>
-      </w:r>
-    </w:p>
-    <w:p>
-      <w:r>
-        <w:rPr>
-          <w:b/>
-        </w:rPr>
         <w:t>Fusion Capital</w:t>
       </w:r>
       <w:r>
-        <w:t xml:space="preserve"> es la alternativa regional por su experiencia documentada de vivienda de alquiler. El estudio de Reall sobre sus inquilinos permite observar mejoras residenciales junto con dificultades de asequibilidad, aunque su muestra no representa a toda Nairobi. Aporta una comparación útil sobre cómo equilibrar calidad y precio. No se propone que las tres empresas formen un consorcio: se selecciona Acorn y se explican las alternativas (Robinson et al., 2025).</w:t>
+        <w:t xml:space="preserve"> es la alternativa regional por su experiencia documentada de vivienda de alquiler. El estudio de Reall sobre sus inquilinos permite observar mejoras residenciales junto con dificultades de asequibilidad, aunque su muestra no representa a toda Nairobi. Aporta una comparación útil sobre cómo equilibrar calidad y precio. Se selecciona Acorn como cabecera y se presenta Fusion Capital como alternativa (Robinson et al., 2025).</w:t>
       </w:r>
     </w:p>
     <w:p>
@@ -1757,7 +1741,7 @@
     </w:p>
     <w:p>
       <w:r>
-        <w:t>La propuesta elige construcción para alquiler, Acorn como cabecera y Riruta como ubicación de estudio. La decisión se apoya en capacidades existentes y una estrategia empresarial compatible, mientras IHS y Fusion permiten contrastar otras formas de organizar capital y operación. No demuestra todavía una rentabilidad ni una demanda garantizadas; plantea una actuación cuya aprobación depende de pruebas de mercado y viabilidad.</w:t>
+        <w:t>La propuesta elige construcción para alquiler, Acorn como cabecera y Riruta como ubicación de estudio. La decisión se apoya en capacidades existentes y una estrategia empresarial compatible, mientras Fusion Capital permite contrastar otra forma de organizar capital y operación. No demuestra todavía una rentabilidad ni una demanda garantizadas; plantea una actuación cuya aprobación depende de pruebas de mercado y viabilidad.</w:t>
       </w:r>
     </w:p>
     <w:p>
@@ -2082,32 +2066,6 @@
           <w:sz w:val="21"/>
         </w:rPr>
         <w:t>. Recuperado el 21 de octubre de 2026, de https://infotradekenya.go.ke/menu/895</w:t>
-      </w:r>
-    </w:p>
-    <w:p>
-      <w:pPr>
-        <w:keepLines/>
-        <w:spacing w:line="288" w:lineRule="auto"/>
-        <w:ind w:left="720" w:hanging="720"/>
-      </w:pPr>
-      <w:r>
-        <w:rPr>
-          <w:sz w:val="21"/>
-        </w:rPr>
-        <w:t xml:space="preserve">International Finance Corporation (2024). </w:t>
-      </w:r>
-      <w:r>
-        <w:rPr>
-          <w:i/>
-          <w:sz w:val="21"/>
-        </w:rPr>
-        <w:t>IHS Kenya: Environmental and social review summary (Project 47136)</w:t>
-      </w:r>
-      <w:r>
-        <w:rPr>
-          <w:sz w:val="21"/>
-        </w:rPr>
-        <w:t>. https://disclosures.ifc.org/project-detail/ESRS/47136/co</w:t>
       </w:r>
     </w:p>
     <w:p>

</xml_diff>

<commit_message>
Revert "Retira la fuente de IFC y los argumentos que dependían de ella"
This reverts commit 3ee50ef5e54f48c08d448f480c53461657ca27df.
</commit_message>
<xml_diff>
--- a/trabajo_africa/documentos/Trabajo_Kenia_Cristina_Moro_APA.docx
+++ b/trabajo_africa/documentos/Trabajo_Kenia_Cristina_Moro_APA.docx
@@ -28,7 +28,7 @@
     </w:p>
     <w:p>
       <w:r>
-        <w:t>Kenia alcanzó la independencia en 1963 con una economía y unas relaciones de acceso a la tierra marcadas por el dominio colonial. La expansión de la pequeña agricultura y la intervención pública dieron paso, desde los años ochenta, a reformas de liberalización y a una mayor participación privada (Gamba &amp; Kibaara, 2007). El crecimiento posterior de los servicios y la innovación ha convivido con diferencias de acceso al empleo y a las oportunidades. Este trabajo plantea que la construcción de vivienda para alquiler en Nairobi puede atraer inversión y mejorar las condiciones de vida de trabajadores, siempre que el producto sea compatible con sus ingresos y se apoye en suelo jurídicamente seguro, servicios adecuados y contratos previsibles. El marco de instituciones inclusivas y extractivas de Acemoglu y Robinson permitirá examinar quién accede a esas oportunidades y cómo se distribuyen los beneficios. Se elige Acorn Holdings como empresa de cabecera y se compara con Fusion Capital.</w:t>
+        <w:t>Kenia alcanzó la independencia en 1963 con una economía y unas relaciones de acceso a la tierra marcadas por el dominio colonial. La expansión de la pequeña agricultura y la intervención pública dieron paso, desde los años ochenta, a reformas de liberalización y a una mayor participación privada (Gamba &amp; Kibaara, 2007). El crecimiento posterior de los servicios y la innovación ha convivido con diferencias de acceso al empleo y a las oportunidades. Este trabajo plantea que la construcción de vivienda para alquiler en Nairobi puede atraer inversión y mejorar las condiciones de vida de trabajadores, siempre que el producto sea compatible con sus ingresos y se apoye en suelo jurídicamente seguro, servicios adecuados y contratos previsibles. El marco de instituciones inclusivas y extractivas de Acemoglu y Robinson permitirá examinar quién accede a esas oportunidades y cómo se distribuyen los beneficios. Se elige Acorn Holdings como empresa de cabecera y se compara con IHS y Fusion Capital.</w:t>
       </w:r>
     </w:p>
     <w:p>
@@ -104,6 +104,11 @@
     </w:p>
     <w:p>
       <w:r>
+        <w:t>Otro activo es la existencia de organizaciones capaces de desarrollar y gestionar vivienda con inversión institucional. La ficha de IFC sobre IHS describe desarrollo y adquisición de vivienda en Nairobi y otras zonas urbanas, con criterios de eficiencia de recursos y colaboración con promotores. Este precedente muestra una vía para organizar capital destinado a vivienda. Una nueva operación necesitaría justificar su demanda, sus costes y la modalidad de tenencia (International Finance Corporation, 2024).</w:t>
+      </w:r>
+    </w:p>
+    <w:p>
+      <w:r>
         <w:t xml:space="preserve">El contexto de inversión debe distinguir flujos anuales y capital acumulado. La ficha keniana del </w:t>
       </w:r>
       <w:r>
@@ -118,7 +123,7 @@
     </w:p>
     <w:p>
       <w:r>
-        <w:t>La iniciativa de Acorn para ampliar el alquiler muestra un precedente de organización institucional de capital. Su desarrollo es una oportunidad condicionada por demanda y ejecución, no una promesa automática de financiación del proyecto (Private Infrastructure Development Group, 2025).</w:t>
+        <w:t>La iniciativa de Acorn para ampliar el alquiler y el programa de IHS muestran precedentes de organización institucional de capital. Su desarrollo es una oportunidad condicionada por demanda y ejecución, no una promesa automática de financiación del proyecto (Private Infrastructure Development Group, 2025).</w:t>
       </w:r>
     </w:p>
     <w:p>
@@ -533,7 +538,7 @@
               <w:rPr>
                 <w:sz w:val="20"/>
               </w:rPr>
-              <w:t xml:space="preserve"> integración regional y posibilidades de captar capital de largo plazo, ilustradas por la iniciativa de Acorn. Su aprovechamiento exige convertir los marcos y compromisos en proyectos ejecutables (§§ 2–3).</w:t>
+              <w:t xml:space="preserve"> integración regional y posibilidades de captar capital de largo plazo, ilustradas por el programa de IHS y la iniciativa de Acorn. Su aprovechamiento exige convertir los marcos y compromisos en proyectos ejecutables (§§ 2–3).</w:t>
             </w:r>
           </w:p>
         </w:tc>
@@ -671,7 +676,7 @@
     </w:p>
     <w:p>
       <w:r>
-        <w:t>Frente a estudiar una nueva implantación en Kampala o Kigali, se prioriza aprovechar las capacidades kenianas ya documentadas de Acorn. Esta elección reduce el número de capacidades que habría que construir desde cero y permite concentrar el análisis en producto y clientes. Es una ventaja de ejecución propuesta, no una superioridad demostrada de Nairobi en rentabilidad o costes.</w:t>
+        <w:t>Frente a estudiar una nueva implantación en Kampala o Kigali, se prioriza aprovechar las capacidades kenianas ya documentadas de Acorn e IHS. Esta elección reduce el número de capacidades que habría que construir desde cero y permite concentrar el análisis en producto y clientes. Es una ventaja de ejecución propuesta, no una superioridad demostrada de Nairobi en rentabilidad o costes.</w:t>
       </w:r>
     </w:p>
     <w:p>
@@ -718,10 +723,21 @@
         <w:rPr>
           <w:b/>
         </w:rPr>
+        <w:t>International Housing Solutions (IHS)</w:t>
+      </w:r>
+      <w:r>
+        <w:t xml:space="preserve"> es una segunda empresa objetivo por su experiencia en fondos de vivienda y su programa keniano. La documentación de IFC contempla alquiler, venta y alquiler con opción de compra; por ello, habría que acordar expresamente una operación destinada a alquiler permanente. Se estudiaría como alternativa para captar y gestionar capital, sin presumir que dispone de fondos comprometidos para esta promoción (International Finance Corporation, 2024).</w:t>
+      </w:r>
+    </w:p>
+    <w:p>
+      <w:r>
+        <w:rPr>
+          <w:b/>
+        </w:rPr>
         <w:t>Fusion Capital</w:t>
       </w:r>
       <w:r>
-        <w:t xml:space="preserve"> es la alternativa regional por su experiencia documentada de vivienda de alquiler. El estudio de Reall sobre sus inquilinos permite observar mejoras residenciales junto con dificultades de asequibilidad, aunque su muestra no representa a toda Nairobi. Aporta una comparación útil sobre cómo equilibrar calidad y precio. Se selecciona Acorn como cabecera y se presenta Fusion Capital como alternativa (Robinson et al., 2025).</w:t>
+        <w:t xml:space="preserve"> es la alternativa regional por su experiencia documentada de vivienda de alquiler. El estudio de Reall sobre sus inquilinos permite observar mejoras residenciales junto con dificultades de asequibilidad, aunque su muestra no representa a toda Nairobi. Aporta una comparación útil sobre cómo equilibrar calidad y precio. No se propone que las tres empresas formen un consorcio: se selecciona Acorn y se explican las alternativas (Robinson et al., 2025).</w:t>
       </w:r>
     </w:p>
     <w:p>
@@ -1741,7 +1757,7 @@
     </w:p>
     <w:p>
       <w:r>
-        <w:t>La propuesta elige construcción para alquiler, Acorn como cabecera y Riruta como ubicación de estudio. La decisión se apoya en capacidades existentes y una estrategia empresarial compatible, mientras Fusion Capital permite contrastar otra forma de organizar capital y operación. No demuestra todavía una rentabilidad ni una demanda garantizadas; plantea una actuación cuya aprobación depende de pruebas de mercado y viabilidad.</w:t>
+        <w:t>La propuesta elige construcción para alquiler, Acorn como cabecera y Riruta como ubicación de estudio. La decisión se apoya en capacidades existentes y una estrategia empresarial compatible, mientras IHS y Fusion permiten contrastar otras formas de organizar capital y operación. No demuestra todavía una rentabilidad ni una demanda garantizadas; plantea una actuación cuya aprobación depende de pruebas de mercado y viabilidad.</w:t>
       </w:r>
     </w:p>
     <w:p>
@@ -2066,6 +2082,32 @@
           <w:sz w:val="21"/>
         </w:rPr>
         <w:t>. Recuperado el 21 de octubre de 2026, de https://infotradekenya.go.ke/menu/895</w:t>
+      </w:r>
+    </w:p>
+    <w:p>
+      <w:pPr>
+        <w:keepLines/>
+        <w:spacing w:line="288" w:lineRule="auto"/>
+        <w:ind w:left="720" w:hanging="720"/>
+      </w:pPr>
+      <w:r>
+        <w:rPr>
+          <w:sz w:val="21"/>
+        </w:rPr>
+        <w:t xml:space="preserve">International Finance Corporation (2024). </w:t>
+      </w:r>
+      <w:r>
+        <w:rPr>
+          <w:i/>
+          <w:sz w:val="21"/>
+        </w:rPr>
+        <w:t>IHS Kenya: Environmental and social review summary (Project 47136)</w:t>
+      </w:r>
+      <w:r>
+        <w:rPr>
+          <w:sz w:val="21"/>
+        </w:rPr>
+        <w:t>. https://disclosures.ifc.org/project-detail/ESRS/47136/co</w:t>
       </w:r>
     </w:p>
     <w:p>

</xml_diff>

<commit_message>
Retira InfoTradeKenya y el contenido asociado a AfCFTA
</commit_message>
<xml_diff>
--- a/trabajo_africa/documentos/Trabajo_Kenia_Cristina_Moro_APA.docx
+++ b/trabajo_africa/documentos/Trabajo_Kenia_Cristina_Moro_APA.docx
@@ -81,12 +81,7 @@
     </w:p>
     <w:p>
       <w:r>
-        <w:t>Kenia participa en la integración africana a través de la Unión Africana y de acuerdos continentales y subregionales (InfoTradeKenya, s. f.). La Comunidad de África Oriental reúne actualmente ocho Estados. Somalia se incorporó como miembro pleno en marzo de 2024. La EAC favorece un marco de cooperación económica cuya relación con el proyecto sería indirecta: actividad empresarial, inversión y movilidad. El mercado residencial de la promoción seguirá siendo local (East African Community, s. f.).</w:t>
-      </w:r>
-    </w:p>
-    <w:p>
-      <w:r>
-        <w:t>Kenia también participa en la AfCFTA. El portal oficial de comercio distingue la entrada en vigor del acuerdo, en mayo de 2019, del inicio del comercio en enero de 2021. Su aplicación gradual exige distinguir la pertenencia al acuerdo de las condiciones efectivas de acceso a cada mercado. Para el proyecto de vivienda en Nairobi, el acuerdo podría generar oportunidades si favorece la inversión y la creación de empleo. Sin embargo, estos posibles efectos no garantizan que exista demanda para los alquileres propuestos (InfoTradeKenya, s. f.).</w:t>
+        <w:t>La Comunidad de África Oriental reúne actualmente ocho Estados. Somalia se incorporó como miembro pleno en marzo de 2024. La EAC favorece un marco de cooperación económica cuya relación con el proyecto sería indirecta: actividad empresarial, inversión y movilidad. El mercado residencial de la promoción seguirá siendo local (East African Community, s. f.).</w:t>
       </w:r>
     </w:p>
     <w:p>
@@ -2068,32 +2063,6 @@
         <w:rPr>
           <w:sz w:val="21"/>
         </w:rPr>
-        <w:t xml:space="preserve">InfoTradeKenya (s. f.). </w:t>
-      </w:r>
-      <w:r>
-        <w:rPr>
-          <w:i/>
-          <w:sz w:val="21"/>
-        </w:rPr>
-        <w:t>AfCFTA market requirements</w:t>
-      </w:r>
-      <w:r>
-        <w:rPr>
-          <w:sz w:val="21"/>
-        </w:rPr>
-        <w:t>. Recuperado el 21 de octubre de 2026, de https://infotradekenya.go.ke/menu/895</w:t>
-      </w:r>
-    </w:p>
-    <w:p>
-      <w:pPr>
-        <w:keepLines/>
-        <w:spacing w:line="288" w:lineRule="auto"/>
-        <w:ind w:left="720" w:hanging="720"/>
-      </w:pPr>
-      <w:r>
-        <w:rPr>
-          <w:sz w:val="21"/>
-        </w:rPr>
         <w:t xml:space="preserve">International Finance Corporation (2024). </w:t>
       </w:r>
       <w:r>

</xml_diff>

<commit_message>
Simplifica el párrafo sobre inversión extranjera directa
</commit_message>
<xml_diff>
--- a/trabajo_africa/documentos/Trabajo_Kenia_Cristina_Moro_APA.docx
+++ b/trabajo_africa/documentos/Trabajo_Kenia_Cristina_Moro_APA.docx
@@ -104,17 +104,14 @@
     </w:p>
     <w:p>
       <w:r>
-        <w:t xml:space="preserve">El contexto de inversión debe distinguir flujos anuales y capital acumulado. La ficha keniana del </w:t>
+        <w:t>El contexto de inversión debe distinguir flujos anuales y capital acumulado. Las entradas de inversión extranjera directa en Kenia alcanzaron 1.503 millones de dólares en 2024, cifra redondeada a 1.500 millones en otra publicación del mismo organismo (UNCTAD, 2025a, 2025b). Se trata de flujos nacionales, no de recursos disponibles para vivienda.</w:t>
       </w:r>
       <w:r>
         <w:rPr>
           <w:i/>
         </w:rPr>
-        <w:t>World Investment Report 2025</w:t>
       </w:r>
-      <w:r>
-        <w:t xml:space="preserve"> de UNCTAD registra entradas de IED de 1.503 millones de dólares en 2024; su informe COMESA 2025 las redondea a 1.500 millones. Se trata de flujos nacionales, no de recursos disponibles para vivienda. Ambas publicaciones comparten la base de UNCTAD: su coincidencia permite contrastar la cifra, pero no constituye una medición independiente. El dato corresponde a 2024 según la edición 2025 (UNCTAD, 2025a, 2025b).</w:t>
-      </w:r>
+      <w:r/>
     </w:p>
     <w:p>
       <w:r>

</xml_diff>

<commit_message>
Simplifica la explicación de los ajustes estructurales y sus costes sociales
</commit_message>
<xml_diff>
--- a/trabajo_africa/documentos/Trabajo_Kenia_Cristina_Moro_APA.docx
+++ b/trabajo_africa/documentos/Trabajo_Kenia_Cristina_Moro_APA.docx
@@ -164,12 +164,18 @@
     </w:p>
     <w:p>
       <w:r>
-        <w:t>Desde 1980, los programas de ajuste estructural impulsaron la liberalización de la economía keniana. Buscaban aumentar la participación privada y orientar la producción hacia mercados externos. Este proceso debe examinarse junto con las restricciones heredadas y las decisiones internas, evitando atribuir los resultados a una única causa (Gamba &amp; Kibaara, 2007).</w:t>
+        <w:rPr>
+          <w:i w:val="0"/>
+        </w:rPr>
+        <w:t>Desde 1980, Kenia aplicó programas de ajuste estructural que buscaban aumentar la participación de las empresas privadas y orientar la producción hacia la exportación. Sus resultados deben analizarse teniendo en cuenta tanto la situación previa del país como las decisiones del Gobierno, sin atribuirlos a una sola causa (Gamba &amp; Kibaara, 2007).</w:t>
       </w:r>
     </w:p>
     <w:p>
       <w:r>
-        <w:t>Los objetivos de eficiencia y estabilización deben contrastarse con la distribución de los costes. El informe de desarrollo humano de Kenia patrocinado por PNUD describe reformas de privatización, empleo público y gasto, además de barreras de acceso a servicios para grupos vulnerables. Esta perspectiva complementa el registro financiero de los organismos acreedores: una reforma puede alterar incentivos y, simultáneamente, reducir la capacidad de determinados hogares para cubrir necesidades. No basta con juzgarla por una sola variable macroeconómica (</w:t>
+        <w:rPr>
+          <w:i w:val="0"/>
+        </w:rPr>
+        <w:t>Estas reformas incluyeron privatizaciones y cambios en el empleo público y el gasto del Estado. Para valorar sus efectos, hay que estudiar cómo afectaron a los distintos grupos sociales. Una mejora de las cuentas públicas puede coexistir con dificultades de algunas familias para acceder a servicios básicos. Por eso, los indicadores económicos no bastan para conocer sus consecuencias sobre el bienestar (</w:t>
       </w:r>
       <w:r>
         <w:rPr>
@@ -178,12 +184,18 @@
         <w:t>Kenya National Human Development Report 2006</w:t>
       </w:r>
       <w:r>
+        <w:rPr>
+          <w:i w:val="0"/>
+        </w:rPr>
         <w:t>, 2006).</w:t>
       </w:r>
     </w:p>
     <w:p>
       <w:r>
-        <w:t>Estas reformas ayudan a entender por qué la capacidad de pago no puede deducirse únicamente del salario. Si el hogar debe asumir más gastos de servicios esenciales, dispone de menos recursos para vivienda. El alquiler se evaluará dentro de ese presupuesto, relacionando la trayectoria económica con las condiciones de los clientes.</w:t>
+        <w:rPr>
+          <w:i w:val="0"/>
+        </w:rPr>
+        <w:t>Esto ayuda a entender por qué el salario no basta para calcular cuánto alquiler puede pagar un hogar. Si una familia tiene que destinar más dinero a servicios esenciales, le queda menos para vivienda. Por ello, el proyecto deberá valorar tanto los ingresos como los gastos de sus futuros inquilinos.</w:t>
       </w:r>
     </w:p>
     <w:p>

</xml_diff>

<commit_message>
Ajusta el apartado sobre instituciones y bienestar al texto acordado
</commit_message>
<xml_diff>
--- a/trabajo_africa/documentos/Trabajo_Kenia_Cristina_Moro_APA.docx
+++ b/trabajo_africa/documentos/Trabajo_Kenia_Cristina_Moro_APA.docx
@@ -354,6 +354,9 @@
     </w:p>
     <w:p>
       <w:r>
+        <w:rPr>
+          <w:i w:val="0"/>
+        </w:rPr>
         <w:t xml:space="preserve">El marco de Acemoglu y Robinson, desarrollado en </w:t>
       </w:r>
       <w:r>
@@ -363,7 +366,10 @@
         <w:t>Why Nations Fail</w:t>
       </w:r>
       <w:r>
-        <w:t xml:space="preserve"> (2012), permite relacionar estas etapas sin atribuir todos los resultados al colonialismo ni a una única reforma. El análisis considera mecanismos concretos: cuando obtener un título o un permiso depende de contactos y rentas, disminuye la competencia y se concentra el acceso al suelo; cuando las reglas son previsibles y exigibles, más actores pueden invertir y contratar. Estos mecanismos son hipótesis interpretativas que deben contrastarse con el caso, no efectos medidos por este informe (Acemoglu &amp; Robinson, 2012). Este enfoque permite examinar diferencias entre ámbitos institucionales de Kenia, sin clasificar al país de forma uniforme como inclusivo o extractivo.</w:t>
+        <w:rPr>
+          <w:i w:val="0"/>
+        </w:rPr>
+        <w:t xml:space="preserve"> (2012), permite relacionar estas etapas sin atribuir todos los resultados al colonialismo ni a una única reforma. El análisis considera mecanismos concretos: cuando obtener un título o un permiso depende de contactos y rentas, disminuye la competencia y se concentra el acceso al suelo; cuando las reglas son previsibles y exigibles, más actores pueden invertir y contratar.</w:t>
       </w:r>
     </w:p>
     <w:p>

</xml_diff>

<commit_message>
Sustituye el DAFO del alquiler por un análisis general de la economía de Kenia
</commit_message>
<xml_diff>
--- a/trabajo_africa/documentos/Trabajo_Kenia_Cristina_Moro_APA.docx
+++ b/trabajo_africa/documentos/Trabajo_Kenia_Cristina_Moro_APA.docx
@@ -387,12 +387,12 @@
         <w:pStyle w:val="Heading1"/>
       </w:pPr>
       <w:r>
-        <w:t>5. DAFO de la economía aplicado a la vivienda de alquiler</w:t>
+        <w:t>5. DAFO de la economía de Kenia</w:t>
       </w:r>
     </w:p>
     <w:p>
       <w:r>
-        <w:t>El DAFO relaciona los hallazgos anteriores con las condiciones que deberá reunir la inversión.</w:t>
+        <w:t>Este DAFO recoge el análisis previo sobre la economía de Kenia, sin aplicarlo al mercado del alquiler.</w:t>
       </w:r>
     </w:p>
     <w:tbl>
@@ -430,15 +430,11 @@
             </w:tcMar>
           </w:tcPr>
           <w:p>
-            <w:pPr>
-              <w:spacing w:line="264" w:lineRule="auto" w:after="60" w:before="60"/>
-            </w:pPr>
             <w:r>
               <w:rPr>
                 <w:b/>
-                <w:sz w:val="20"/>
               </w:rPr>
-              <w:t>Mirada interna</w:t>
+              <w:t>Fortalezas</w:t>
             </w:r>
           </w:p>
         </w:tc>
@@ -461,22 +457,119 @@
             </w:tcMar>
           </w:tcPr>
           <w:p>
-            <w:pPr>
-              <w:spacing w:line="264" w:lineRule="auto" w:after="60" w:before="60"/>
-            </w:pPr>
             <w:r>
               <w:rPr>
                 <w:b/>
-                <w:sz w:val="20"/>
               </w:rPr>
-              <w:t>Mirada externa</w:t>
+              <w:t>Debilidades</w:t>
             </w:r>
           </w:p>
         </w:tc>
       </w:tr>
       <w:tr>
+        <w:tc>
+          <w:tcPr>
+            <w:tcW w:type="dxa" w:w="4658"/>
+          </w:tcPr>
+          <w:p>
+            <w:r>
+              <w:t>Diversidad de actividades económicas. La presencia de agricultura, comercio, finanzas, transporte y servicios de información ofrece distintas fuentes de producción e ingresos.</w:t>
+            </w:r>
+          </w:p>
+        </w:tc>
+        <w:tc>
+          <w:tcPr>
+            <w:tcW w:type="dxa" w:w="4658"/>
+          </w:tcPr>
+          <w:p>
+            <w:r>
+              <w:t>Elevada informalidad laboral. El crecimiento económico no se traduce necesariamente en empleo estable, protección social y mejoras de ingresos para toda la población.</w:t>
+            </w:r>
+          </w:p>
+        </w:tc>
+      </w:tr>
+      <w:tr>
+        <w:tc>
+          <w:tcPr>
+            <w:tcW w:type="dxa" w:w="4658"/>
+          </w:tcPr>
+          <w:p>
+            <w:r>
+              <w:t>Desarrollo de servicios e innovación financiera. La experiencia en pagos móviles facilita transacciones y ofrece herramientas para ampliar la participación en la economía.</w:t>
+            </w:r>
+          </w:p>
+        </w:tc>
+        <w:tc>
+          <w:tcPr>
+            <w:tcW w:type="dxa" w:w="4658"/>
+          </w:tcPr>
+          <w:p>
+            <w:r>
+              <w:t>Desigualdad de acceso a las oportunidades. Persisten diferencias en el acceso al empleo, la financiación, la tierra y los servicios básicos, que limitan la distribución de los beneficios del crecimiento.</w:t>
+            </w:r>
+          </w:p>
+        </w:tc>
+      </w:tr>
+      <w:tr>
+        <w:tc>
+          <w:tcPr>
+            <w:tcW w:type="dxa" w:w="4658"/>
+          </w:tcPr>
+          <w:p>
+            <w:r>
+              <w:t>Concentración de actividad empresarial en Nairobi. La capital reúne empresas y servicios que pueden facilitar la inversión y las relaciones comerciales.</w:t>
+            </w:r>
+          </w:p>
+        </w:tc>
+        <w:tc>
+          <w:tcPr>
+            <w:tcW w:type="dxa" w:w="4658"/>
+          </w:tcPr>
+          <w:p>
+            <w:r>
+              <w:t>Restricciones fiscales. El elevado endeudamiento reduce el margen del Estado para financiar servicios, infraestructura y medidas de apoyo durante las crisis.</w:t>
+            </w:r>
+          </w:p>
+        </w:tc>
+      </w:tr>
+      <w:tr>
+        <w:tc>
+          <w:tcPr>
+            <w:tcW w:type="dxa" w:w="4658"/>
+          </w:tcPr>
+          <w:p>
+            <w:r>
+              <w:t>Capacidad para atraer inversión extranjera. Las entradas de inversión documentadas muestran vínculos con capital internacional que pueden contribuir al desarrollo productivo.</w:t>
+            </w:r>
+          </w:p>
+        </w:tc>
+        <w:tc>
+          <w:tcPr>
+            <w:tcW w:type="dxa" w:w="4658"/>
+          </w:tcPr>
+          <w:p>
+            <w:r>
+              <w:t>Problemas de gobernanza y seguridad jurídica. La corrupción y la falta de previsibilidad de determinados procedimientos pueden dificultar la competencia y elevar los costes de inversión.</w:t>
+            </w:r>
+          </w:p>
+        </w:tc>
+      </w:tr>
+    </w:tbl>
+    <w:tbl>
+      <w:tblPr>
+        <w:tblW w:type="auto" w:w="0"/>
+        <w:jc w:val="center"/>
+        <w:tblLayout w:type="fixed"/>
+        <w:tblLook w:firstColumn="1" w:firstRow="1" w:lastColumn="0" w:lastRow="0" w:noHBand="0" w:noVBand="1" w:val="04A0"/>
+      </w:tblPr>
+      <w:tblGrid>
+        <w:gridCol w:w="4658"/>
+        <w:gridCol w:w="4658"/>
+      </w:tblGrid>
+      <w:tr>
         <w:trPr>
           <w:cantSplit/>
+          <w:tblHeader/>
         </w:trPr>
         <w:tc>
           <w:tcPr>
@@ -488,7 +581,7 @@
               <w:bottom w:val="single" w:sz="4" w:color="D9D9D9"/>
               <w:right w:val="single" w:sz="4" w:color="D9D9D9"/>
             </w:tcBorders>
-            <w:shd w:fill="FFFFFF"/>
+            <w:shd w:fill="E8EEF1"/>
             <w:tcMar>
               <w:top w:w="90" w:type="dxa"/>
               <w:left w:w="90" w:type="dxa"/>
@@ -497,21 +590,11 @@
             </w:tcMar>
           </w:tcPr>
           <w:p>
-            <w:pPr>
-              <w:spacing w:line="264" w:lineRule="auto" w:after="60" w:before="60"/>
-            </w:pPr>
             <w:r>
               <w:rPr>
                 <w:b/>
-                <w:sz w:val="20"/>
               </w:rPr>
-              <w:t>Fortalezas:</w:t>
-            </w:r>
-            <w:r>
-              <w:rPr>
-                <w:sz w:val="20"/>
-              </w:rPr>
-              <w:t xml:space="preserve"> concentración de actividad en Nairobi; experiencia en servicios y pagos digitales; presencia de promotores y vehículos institucionales de vivienda. Estas capacidades permiten estudiar una oferta de alquiler gestionada profesionalmente (§§ 2–3).</w:t>
+              <w:t>Oportunidades</w:t>
             </w:r>
           </w:p>
         </w:tc>
@@ -525,7 +608,7 @@
               <w:bottom w:val="single" w:sz="4" w:color="D9D9D9"/>
               <w:right w:val="single" w:sz="4" w:color="D9D9D9"/>
             </w:tcBorders>
-            <w:shd w:fill="FFFFFF"/>
+            <w:shd w:fill="E8EEF1"/>
             <w:tcMar>
               <w:top w:w="90" w:type="dxa"/>
               <w:left w:w="90" w:type="dxa"/>
@@ -534,100 +617,99 @@
             </w:tcMar>
           </w:tcPr>
           <w:p>
-            <w:pPr>
-              <w:spacing w:line="264" w:lineRule="auto" w:after="60" w:before="60"/>
-            </w:pPr>
             <w:r>
               <w:rPr>
                 <w:b/>
-                <w:sz w:val="20"/>
               </w:rPr>
-              <w:t>Oportunidades:</w:t>
-            </w:r>
-            <w:r>
-              <w:rPr>
-                <w:sz w:val="20"/>
-              </w:rPr>
-              <w:t xml:space="preserve"> integración regional y posibilidades de captar capital de largo plazo, ilustradas por el programa de IHS y la iniciativa de Acorn. Su aprovechamiento exige convertir los marcos y compromisos en proyectos ejecutables (§§ 2–3).</w:t>
+              <w:t>Amenazas</w:t>
             </w:r>
           </w:p>
         </w:tc>
       </w:tr>
       <w:tr>
-        <w:trPr>
-          <w:cantSplit/>
-        </w:trPr>
         <w:tc>
           <w:tcPr>
             <w:tcW w:type="dxa" w:w="4658"/>
-            <w:vAlign w:val="center"/>
-            <w:tcBorders>
-              <w:top w:val="single" w:sz="4" w:color="D9D9D9"/>
-              <w:left w:val="single" w:sz="4" w:color="D9D9D9"/>
-              <w:bottom w:val="single" w:sz="4" w:color="D9D9D9"/>
-              <w:right w:val="single" w:sz="4" w:color="D9D9D9"/>
-            </w:tcBorders>
-            <w:shd w:fill="F6F8F9"/>
-            <w:tcMar>
-              <w:top w:w="90" w:type="dxa"/>
-              <w:left w:w="90" w:type="dxa"/>
-              <w:bottom w:w="90" w:type="dxa"/>
-              <w:right w:w="90" w:type="dxa"/>
-            </w:tcMar>
           </w:tcPr>
           <w:p>
-            <w:pPr>
-              <w:spacing w:line="264" w:lineRule="auto" w:after="60" w:before="60"/>
-            </w:pPr>
             <w:r>
-              <w:rPr>
-                <w:b/>
-                <w:sz w:val="20"/>
-              </w:rPr>
-              <w:t>Debilidades:</w:t>
-            </w:r>
-            <w:r>
-              <w:rPr>
-                <w:sz w:val="20"/>
-              </w:rPr>
-              <w:t xml:space="preserve"> creación insuficiente de empleo formal, restricciones de capacidad de pago y problemas de gobernanza. El suelo y los servicios requieren comprobación local. La necesidad residencial no equivale a demanda solvente (§§ 2–4).</w:t>
+              <w:t>Integración regional. La participación en la Comunidad de África Oriental ofrece posibilidades de ampliar mercados y fortalecer las relaciones comerciales y empresariales.</w:t>
             </w:r>
           </w:p>
         </w:tc>
         <w:tc>
           <w:tcPr>
             <w:tcW w:type="dxa" w:w="4658"/>
-            <w:vAlign w:val="center"/>
-            <w:tcBorders>
-              <w:top w:val="single" w:sz="4" w:color="D9D9D9"/>
-              <w:left w:val="single" w:sz="4" w:color="D9D9D9"/>
-              <w:bottom w:val="single" w:sz="4" w:color="D9D9D9"/>
-              <w:right w:val="single" w:sz="4" w:color="D9D9D9"/>
-            </w:tcBorders>
-            <w:shd w:fill="F6F8F9"/>
-            <w:tcMar>
-              <w:top w:w="90" w:type="dxa"/>
-              <w:left w:w="90" w:type="dxa"/>
-              <w:bottom w:w="90" w:type="dxa"/>
-              <w:right w:w="90" w:type="dxa"/>
-            </w:tcMar>
           </w:tcPr>
           <w:p>
-            <w:pPr>
-              <w:spacing w:line="264" w:lineRule="auto" w:after="60" w:before="60"/>
-            </w:pPr>
             <w:r>
-              <w:rPr>
-                <w:b/>
-                <w:sz w:val="20"/>
-              </w:rPr>
-              <w:t>Amenazas:</w:t>
+              <w:t>Fenómenos climáticos extremos. Las inundaciones y otros episodios pueden dañar infraestructura, afectar a la producción agrícola e interrumpir la actividad económica.</w:t>
             </w:r>
+          </w:p>
+        </w:tc>
+      </w:tr>
+      <w:tr>
+        <w:tc>
+          <w:tcPr>
+            <w:tcW w:type="dxa" w:w="4658"/>
+          </w:tcPr>
+          <w:p>
             <w:r>
-              <w:rPr>
-                <w:sz w:val="20"/>
-              </w:rPr>
-              <w:t xml:space="preserve"> shocks climáticos, dificultades de financiación y volatilidad económica. La presión fiscal limita la capacidad de respaldar inversiones y los hogares pueden perder margen de gasto durante una crisis (§ 4.4).</w:t>
+              <w:t>Expansión de servicios digitales. Su desarrollo puede mejorar la gestión empresarial, facilitar pagos y ampliar el acceso a servicios financieros.</w:t>
+            </w:r>
+          </w:p>
+        </w:tc>
+        <w:tc>
+          <w:tcPr>
+            <w:tcW w:type="dxa" w:w="4658"/>
+          </w:tcPr>
+          <w:p>
+            <w:r>
+              <w:t>Cambios desfavorables en la financiación internacional. Un encarecimiento o una menor disponibilidad de capital puede dificultar la inversión y aumentar las presiones sobre las finanzas públicas.</w:t>
+            </w:r>
+          </w:p>
+        </w:tc>
+      </w:tr>
+      <w:tr>
+        <w:tc>
+          <w:tcPr>
+            <w:tcW w:type="dxa" w:w="4658"/>
+          </w:tcPr>
+          <w:p>
+            <w:r>
+              <w:t>Inversión orientada a diversificar y modernizar la producción. La captación de capital puede apoyar infraestructura, tecnología y actividades de mayor valor añadido, si existen condiciones adecuadas de ejecución.</w:t>
+            </w:r>
+          </w:p>
+        </w:tc>
+        <w:tc>
+          <w:tcPr>
+            <w:tcW w:type="dxa" w:w="4658"/>
+          </w:tcPr>
+          <w:p>
+            <w:r>
+              <w:t>Crisis económicas y sanitarias externas. La pandemia mostró que estas perturbaciones pueden reducir la actividad y los ingresos, incluso después de etapas de crecimiento.</w:t>
+            </w:r>
+          </w:p>
+        </w:tc>
+      </w:tr>
+      <w:tr>
+        <w:tc>
+          <w:tcPr>
+            <w:tcW w:type="dxa" w:w="4658"/>
+          </w:tcPr>
+          <w:p>
+            <w:r>
+              <w:t>Aprovechamiento de una población joven. Una mayor incorporación al empleo productivo puede ampliar la capacidad económica del país, siempre que vaya acompañada de formación y oportunidades laborales.</w:t>
+            </w:r>
+          </w:p>
+        </w:tc>
+        <w:tc>
+          <w:tcPr>
+            <w:tcW w:type="dxa" w:w="4658"/>
+          </w:tcPr>
+          <w:p>
+            <w:r>
+              <w:t>Incertidumbre política y tensiones sociales. Los problemas institucionales y las dificultades económicas pueden afectar a la confianza y a la continuidad de la actividad empresarial.</w:t>
             </w:r>
           </w:p>
         </w:tc>
@@ -640,7 +722,7 @@
     </w:p>
     <w:p>
       <w:r>
-        <w:t>Las fortalezas y oportunidades justifican explorar el proyecto, mientras las debilidades y amenazas condicionan su diseño. La respuesta a ingresos limitados debe ser ajustar producto y costes; la respuesta a riesgos climáticos, escoger y diseñar bien la parcela; y la respuesta a incertidumbre institucional, asegurar trazabilidad y reglas contractuales. Estas condiciones guían el plan de inversión.</w:t>
+        <w:t>El análisis muestra una economía con capacidades en servicios, innovación y atracción de inversión, pero con dificultades para convertir el crecimiento en bienestar generalizado. Su evolución dependerá de la creación de empleo productivo, la mejora institucional y la capacidad para afrontar las restricciones fiscales y los riesgos climáticos.</w:t>
       </w:r>
     </w:p>
     <w:p>

</xml_diff>

<commit_message>
Reelabora el plan de acción conectado con el DAFO económico
</commit_message>
<xml_diff>
--- a/trabajo_africa/documentos/Trabajo_Kenia_Cristina_Moro_APA.docx
+++ b/trabajo_africa/documentos/Trabajo_Kenia_Cristina_Moro_APA.docx
@@ -730,7 +730,7 @@
         <w:pStyle w:val="Heading1"/>
       </w:pPr>
       <w:r>
-        <w:t>6. Propuesta de inversión y plan de acción</w:t>
+        <w:t>6. Plan de acción final: inversión en vivienda de alquiler en Nairobi</w:t>
       </w:r>
     </w:p>
     <w:p>
@@ -738,37 +738,37 @@
         <w:pStyle w:val="Heading2"/>
       </w:pPr>
       <w:r>
-        <w:t>6.1. Sector, producto y modalidad de inversión</w:t>
+        <w:t>6.1. Propuesta de atracción de inversión</w:t>
       </w:r>
     </w:p>
     <w:p>
       <w:r>
-        <w:t>Se propone ampliar la inversión en vivienda construida para alquiler de larga duración en Nairobi. La ubicación de estudio es Riruta y el público prioritario son hogares pequeños de trabajadores con ingresos regulares, incluidos autónomos capaces de documentarlos. El producto combinaría estudios y viviendas de un dormitorio. La proporción, superficie y número de unidades se decidirían después de comprobar demanda y costes; la propuesta no presupone que exista ya una parcela disponible.</w:t>
+        <w:t>La apuesta de este trabajo es atraer inversión de largo plazo para construir y gestionar viviendas de alquiler en Nairobi, con Riruta como zona inicial de estudio. El producto combinaría estudios y viviendas de un dormitorio destinados a hogares pequeños de trabajadores con ingresos documentables, incluidos autónomos. La propuesta aprovecha tres fortalezas del DAFO: la concentración de actividad empresarial en Nairobi, la experiencia en servicios y pagos digitales y la capacidad de atraer capital extranjero. La oportunidad consiste en reunir esas capacidades en una oferta de alquiler con mantenimiento y atención al residente gestionados profesionalmente.</w:t>
       </w:r>
     </w:p>
     <w:p>
       <w:r>
-        <w:t>La elección frente a vivienda para venta responde al objetivo del trabajo: atender una necesidad residencial sin exigir una compra ni un compromiso hipotecario al cliente. Frente a oficinas o alojamiento turístico, permite vincular más directamente la inversión con condiciones de vida de trabajadores. La elección responde a ese objetivo residencial; no implica que sea el segmento más rentable.</w:t>
+        <w:t>Se elige este sector frente a la vivienda para venta, las oficinas y el alojamiento turístico porque permite vincular la inversión con una necesidad residencial de trabajadores sin exigirles una compra ni una hipoteca. No se sostiene que sea el sector más rentable de Kenia: se defiende que es el que mejor conecta el objetivo social del trabajo con las capacidades empresariales documentadas. El hueco que se propone investigar es el de hogares que necesitan vivienda estable, pero no quieren o no pueden comprar. Su tamaño y su capacidad de pago deberán comprobarse antes de construir.</w:t>
       </w:r>
     </w:p>
     <w:p>
       <w:r>
-        <w:t>Riruta se selecciona como zona de estudio porque existen actuaciones residenciales documentadas en ella. El estudio ambiental de 2025 del proyecto Keza–IHS sitúa esa promoción en Ndwaru Road, Dagoretti South, Nairobi, y señala necesidades locales de seguridad peatonal (Centric Africa Ltd., 2025). Es una referencia para estudiar competencia, accesos y servicios, aunque sus conclusiones corresponden a otra promoción y no se pueden trasladar a una parcela de Acorn.</w:t>
+        <w:t>Riruta ofrece un punto de partida concreto porque cuenta con actuaciones residenciales documentadas. Un estudio ambiental sitúa el proyecto Keza–IHS en Ndwaru Road, Dagoretti South, y señala necesidades de seguridad peatonal (Centric Africa Ltd., 2025). Este antecedente justifica estudiar competencia, accesos y servicios en la zona; no demuestra que haya una parcela disponible ni que la demanda de otra promoción sea trasladable a la propuesta.</w:t>
       </w:r>
     </w:p>
     <w:p>
       <w:r>
-        <w:t>La capacidad de pago se evaluará sobre ingreso neto del hogar, alquiler, servicios, depósito y transporte. La estabilidad laboral no elimina las restricciones presupuestarias (Shah, Zamara y Centre for Affordable Housing Finance in Africa, 2026). Los datos del estudio no proporcionan una mediana representativa de Riruta. Por eso no se fija una tarifa ni se califica el producto como asequible de antemano. Se propone vivienda para un segmento de trabajadores con capacidad acreditada, reconociendo que el de menor ingreso podría necesitar otra estructura de costes o apoyo específico.</w:t>
+        <w:t>El inversor prioritario sería un fondo de capital de largo plazo especializado en vivienda, asociado con un promotor y gestor local. La inversión se canalizaría mediante una participación en la sociedad propietaria de las viviendas, manteniendo la propiedad y la gestión unificadas. Si el capital procede del extranjero, su clasificación como inversión extranjera directa dependerá de las características de la participación. Se priorizará una estructura financiera compatible con ingresos en chelines, para limitar el riesgo de pagar deuda en divisas con alquileres en moneda local.</w:t>
       </w:r>
     </w:p>
     <w:p>
       <w:r>
-        <w:t>Se propone financiar el proyecto con inversión a largo plazo y contar con una empresa local que organice la construcción y gestione las viviendas. La propiedad se mantendría unificada, con responsabilidades claras sobre mantenimiento, cobros y atención a los inquilinos. Un inversor extranjero podría participar en la sociedad propietaria del edificio, de acuerdo con las normas legales y financieras aplicables. Esta participación se consideraría inversión extranjera directa si cumple los criterios correspondientes.</w:t>
+        <w:t>El argumento de Kenia frente a una nueva implantación en Kampala o Kigali es la posibilidad de trabajar con empresas que ya cuentan con experiencia documentada en el mercado keniano. Esta base permite concentrar recursos en seleccionar la parcela, ajustar el producto y captar clientes, en lugar de crear toda la capacidad operativa desde cero. Es una ventaja de ejecución para esta propuesta; la información reunida no permite afirmar que Nairobi ofrezca mayor rentabilidad o menores costes que ambas ciudades.</w:t>
       </w:r>
     </w:p>
     <w:p>
       <w:r>
-        <w:t>Frente a estudiar una nueva implantación en Kampala o Kigali, se prioriza aprovechar las capacidades kenianas ya documentadas de Acorn e IHS. Esta elección reduce el número de capacidades que habría que construir desde cero y permite concentrar el análisis en producto y clientes.</w:t>
+        <w:t>Las debilidades del DAFO determinan el diseño: la informalidad y las restricciones presupuestarias obligan a estudiar ingresos y gastos reales, y los problemas de gobernanza exigen revisar suelo y permisos. La existencia de ingresos recurrentes no elimina las dificultades de acceso a vivienda (Shah, Zamara y Centre for Affordable Housing Finance in Africa, 2026). Por ello, no se fija todavía una tarifa ni se presenta el producto como asequible para toda la población de bajos ingresos.</w:t>
       </w:r>
     </w:p>
     <w:p>
@@ -776,60 +776,63 @@
         <w:pStyle w:val="Heading2"/>
       </w:pPr>
       <w:r>
-        <w:t>6.2. Empresas objetivo y empresa de cabecera</w:t>
+        <w:t>6.2. Empresas objetivo y elección de Acorn Holdings como cabecera</w:t>
       </w:r>
     </w:p>
     <w:p>
       <w:r>
+        <w:t>Se seleccionan tres empresas reales por sus capacidades documentadas en vivienda y gestión de capital. Son candidatas a explorar, no inversores que hayan comprometido recursos para este proyecto.</w:t>
+      </w:r>
+    </w:p>
+    <w:p>
+      <w:r/>
+      <w:r>
         <w:rPr>
           <w:b/>
         </w:rPr>
-        <w:t>Acorn Holdings</w:t>
+        <w:t>Acorn Holdings.</w:t>
       </w:r>
       <w:r>
-        <w:t xml:space="preserve"> es la empresa de cabecera elegida porque combina desarrollo, propiedad y gestión de alquiler. Su estrategia corporativa plantea extender su experiencia desde estudiantes hacia jóvenes profesionales y, posteriormente, familias. Esto encaja con trabajadores que comienzan una etapa residencial independiente, aunque obliga a comprobar que sus ingresos y necesidades corresponden al producto. La experiencia estudiantil es transferible en gestión, pero no demuestra por sí sola aceptación de viviendas para parejas o familias (Acorn Holdings, s. f.).</w:t>
+        <w:t xml:space="preserve"> Es la primera opción y la empresa de cabecera. Combina desarrollo, propiedad y gestión de alquiler, y su estrategia contempla ampliar su actividad desde estudiantes hacia jóvenes profesionales y familias (Acorn Holdings, s. f.). Además, se ha anunciado un vehículo de inversión inmobiliaria orientado al alquiler para jóvenes urbanos que han terminado sus estudios (Private Infrastructure Development Group, 2025). Esta orientación encaja con el segmento propuesto mejor que una empresa dedicada exclusivamente a vender viviendas. El anuncio no acredita una promoción de Acorn en Riruta.</w:t>
+      </w:r>
+    </w:p>
+    <w:p>
+      <w:r/>
+      <w:r>
+        <w:rPr>
+          <w:b/>
+        </w:rPr>
+        <w:t>International Housing Solutions.</w:t>
+      </w:r>
+      <w:r>
+        <w:t xml:space="preserve"> Es la segunda candidata por su experiencia en fondos de vivienda y su programa keniano. Su actividad documentada contempla alquiler, venta y alquiler con opción de compra (International Finance Corporation, 2024). Podría aportar capacidad de inversión y relaciones con promotores, pero habría que acordar expresamente que la operación se mantuviera destinada al alquiler de larga duración. Por esta diferencia de modalidades, se sitúa como alternativa a Acorn y no como cabecera preferente.</w:t>
+      </w:r>
+    </w:p>
+    <w:p>
+      <w:r/>
+      <w:r>
+        <w:rPr>
+          <w:b/>
+        </w:rPr>
+        <w:t>Fusion Capital.</w:t>
+      </w:r>
+      <w:r>
+        <w:t xml:space="preserve"> Es la tercera candidata por su experiencia regional en vivienda de alquiler. La información sobre sus inquilinos permite identificar mejoras residenciales junto con dificultades de asequibilidad (Robinson et al., 2025). Su interés para la propuesta reside en esa experiencia operativa y en la posibilidad de contrastar decisiones de calidad y precio. La muestra del estudio no permite estimar la demanda de toda Nairobi ni confirma su interés en financiar una nueva promoción.</w:t>
       </w:r>
     </w:p>
     <w:p>
       <w:r>
-        <w:t>La selección también responde a una iniciativa concreta. PIDG anunció el 17 de noviembre de 2025 la autorización de un Acorn Build-To-Rent Development REIT destinado a jóvenes urbanos que han terminado sus estudios, con capital comprometido para su establecimiento. El anuncio respalda la coherencia estratégica de nuestra propuesta; no acredita que haya una promoción de Acorn en Riruta ni viviendas terminadas para estos clientes. El trabajo plantea una posible ampliación, no atribuye a la empresa decisiones que no ha anunciado (Private Infrastructure Development Group, 2025).</w:t>
+        <w:t>La elección de Acorn es una decisión del trabajo basada en información pública, no en una relación personal o profesional con la empresa. Se le asignaría la coordinación del diseño, la contratación, la captación de capital y la gestión posterior. Su valor añadido potencial sería mantener una responsabilidad clara durante todo el ciclo del inmueble, transferir experiencia de gestión y generar empleo y compras locales. La formación, las contrataciones y los proveedores deberán registrarse para comprobar esa aportación.</w:t>
       </w:r>
     </w:p>
     <w:p>
       <w:r>
-        <w:t>Su aportación potencial sería organizar diseño, contratación, captación de capital y explotación, además de implantar mantenimiento y atención al inquilino. El valor añadido local deberá concretarse en empleo, formación y compras a proveedores, sin dar por hecho que se produzca por la sola presencia de una empresa institucional. La integración de desarrollo y gestión permitiría asignarle responsabilidades durante la construcción y el uso del inmueble.</w:t>
+        <w:t>El mercado objetivo de Acorn serían hogares pequeños que valoren estabilidad residencial, mantenimiento y acceso al empleo. La concentración de actividad en Nairobi y la estrategia empresarial documentada justifican estudiar ese mercado, pero no permiten calcular todavía el número de clientes ni su disposición a pagar. Durante la preparación se compararán alquileres y viviendas alternativas y se consultará a trabajadores, empleadores y organizaciones profesionales. El presupuesto del hogar incluirá alquiler, suministros, depósito y transporte. La experiencia de Acorn en alojamiento estudiantil será un punto de partida de gestión, no una prueba de aceptación por parejas o familias.</w:t>
       </w:r>
     </w:p>
     <w:p>
       <w:r>
-        <w:t>El mercado potencial de Acorn comprende hogares que valoren estabilidad, servicios y proximidad al empleo. Su disposición a pagar debe contrastarse con alternativas existentes. Se propone consultar empleadores y organizaciones profesionales, sin limitar el acceso a empleados de una única empresa ni convertir una intención de interés en una reserva firme.</w:t>
-      </w:r>
-    </w:p>
-    <w:p>
-      <w:r>
-        <w:t>La continuidad de Acorn como cabecera estará condicionada al ajuste entre costes e ingresos. Un producto que solo resulte viable para hogares de mayor poder adquisitivo requeriría redefinir su alcance. La profesionalización aportará inclusión si mejora estabilidad y servicios a un coste asumible; su contribución debe verificarse mediante resultados de los residentes.</w:t>
-      </w:r>
-    </w:p>
-    <w:p>
-      <w:r>
-        <w:rPr>
-          <w:b/>
-        </w:rPr>
-        <w:t>International Housing Solutions (IHS)</w:t>
-      </w:r>
-      <w:r>
-        <w:t xml:space="preserve"> es una segunda empresa objetivo por su experiencia en fondos de vivienda y su programa keniano. La documentación de IFC contempla alquiler, venta y alquiler con opción de compra; por ello, habría que acordar expresamente una operación destinada a alquiler permanente. Se estudiaría como alternativa para captar y gestionar capital, sin presumir que dispone de fondos comprometidos para esta promoción (International Finance Corporation, 2024).</w:t>
-      </w:r>
-    </w:p>
-    <w:p>
-      <w:r>
-        <w:rPr>
-          <w:b/>
-        </w:rPr>
-        <w:t>Fusion Capital</w:t>
-      </w:r>
-      <w:r>
-        <w:t xml:space="preserve"> es la alternativa regional por su experiencia documentada de vivienda de alquiler. El estudio de Reall sobre sus inquilinos permite observar mejoras residenciales junto con dificultades de asequibilidad, aunque su muestra no representa a toda Nairobi. Aporta una comparación útil sobre cómo equilibrar calidad y precio. No se propone que las tres empresas formen un consorcio: se selecciona Acorn y se explican las alternativas (Robinson et al., 2025).</w:t>
+        <w:t>La decisión es, por tanto, negociar primero con Acorn y utilizar International Housing Solutions y Fusion Capital como alternativas para contrastar condiciones. No se presupone un consorcio entre las tres. Si el coste total solo permite atender a hogares de mayores ingresos, se revisará el producto y su justificación social antes de aprobar la construcción.</w:t>
       </w:r>
     </w:p>
     <w:p>
@@ -837,59 +840,37 @@
         <w:pStyle w:val="Heading2"/>
       </w:pPr>
       <w:r>
-        <w:t>6.3. Plan 360º responsables, plazos e indicadores</w:t>
+        <w:t>6.3. Plan de acción 360º: medidas, responsables y plazos</w:t>
       </w:r>
     </w:p>
     <w:p>
       <w:r>
-        <w:t>El calendario es una propuesta propia desde el inicio del estudio. La apertura dependerá de parcela, permisos, diseño y financiación; los plazos no son compromisos de empresas o autoridades.</w:t>
+        <w:t>El plan convierte las debilidades y amenazas del DAFO en actuaciones verificables. Los plazos se cuentan desde el inicio del estudio y son propuestas del trabajo, no compromisos asumidos por empresas o autoridades. Los meses 0–6 se dedicarían a demanda y parcelas; los meses 6–12, al diseño, las autorizaciones y la financiación. El calendario de obra se aprobaría después de completar esas comprobaciones.</w:t>
       </w:r>
     </w:p>
     <w:tbl>
       <w:tblPr>
+        <w:tblStyle w:val="TableGrid"/>
         <w:tblW w:type="auto" w:w="0"/>
-        <w:jc w:val="center"/>
-        <w:tblLayout w:type="fixed"/>
         <w:tblLook w:firstColumn="1" w:firstRow="1" w:lastColumn="0" w:lastRow="0" w:noHBand="0" w:noVBand="1" w:val="04A0"/>
       </w:tblPr>
       <w:tblGrid>
-        <w:gridCol w:w="1512"/>
-        <w:gridCol w:w="2592"/>
-        <w:gridCol w:w="1872"/>
-        <w:gridCol w:w="1368"/>
-        <w:gridCol w:w="1973"/>
+        <w:gridCol w:w="1863"/>
+        <w:gridCol w:w="1863"/>
+        <w:gridCol w:w="1863"/>
+        <w:gridCol w:w="1863"/>
+        <w:gridCol w:w="1863"/>
       </w:tblGrid>
       <w:tr>
-        <w:trPr>
-          <w:cantSplit/>
-          <w:tblHeader/>
-        </w:trPr>
         <w:tc>
           <w:tcPr>
-            <w:tcW w:type="dxa" w:w="1512"/>
-            <w:vAlign w:val="center"/>
-            <w:tcBorders>
-              <w:top w:val="single" w:sz="4" w:color="D9D9D9"/>
-              <w:left w:val="single" w:sz="4" w:color="D9D9D9"/>
-              <w:bottom w:val="single" w:sz="4" w:color="D9D9D9"/>
-              <w:right w:val="single" w:sz="4" w:color="D9D9D9"/>
-            </w:tcBorders>
-            <w:shd w:fill="E8EEF1"/>
-            <w:tcMar>
-              <w:top w:w="90" w:type="dxa"/>
-              <w:left w:w="90" w:type="dxa"/>
-              <w:bottom w:w="90" w:type="dxa"/>
-              <w:right w:w="90" w:type="dxa"/>
-            </w:tcMar>
+            <w:tcW w:type="dxa" w:w="1863"/>
           </w:tcPr>
           <w:p>
-            <w:pPr>
-              <w:spacing w:line="264" w:lineRule="auto" w:after="60" w:before="60"/>
-            </w:pPr>
             <w:r>
               <w:rPr>
                 <w:b/>
-                <w:sz w:val="18"/>
+                <w:sz w:val="16"/>
               </w:rPr>
               <w:t>Palanca</w:t>
             </w:r>
@@ -897,61 +878,27 @@
         </w:tc>
         <w:tc>
           <w:tcPr>
-            <w:tcW w:type="dxa" w:w="2592"/>
-            <w:vAlign w:val="center"/>
-            <w:tcBorders>
-              <w:top w:val="single" w:sz="4" w:color="D9D9D9"/>
-              <w:left w:val="single" w:sz="4" w:color="D9D9D9"/>
-              <w:bottom w:val="single" w:sz="4" w:color="D9D9D9"/>
-              <w:right w:val="single" w:sz="4" w:color="D9D9D9"/>
-            </w:tcBorders>
-            <w:shd w:fill="E8EEF1"/>
-            <w:tcMar>
-              <w:top w:w="90" w:type="dxa"/>
-              <w:left w:w="90" w:type="dxa"/>
-              <w:bottom w:w="90" w:type="dxa"/>
-              <w:right w:w="90" w:type="dxa"/>
-            </w:tcMar>
+            <w:tcW w:type="dxa" w:w="1863"/>
           </w:tcPr>
           <w:p>
-            <w:pPr>
-              <w:spacing w:line="264" w:lineRule="auto" w:after="60" w:before="60"/>
-            </w:pPr>
             <w:r>
               <w:rPr>
                 <w:b/>
-                <w:sz w:val="18"/>
+                <w:sz w:val="16"/>
               </w:rPr>
-              <w:t>Actuación propuesta</w:t>
+              <w:t>Actuación y relación con el DAFO</w:t>
             </w:r>
           </w:p>
         </w:tc>
         <w:tc>
           <w:tcPr>
-            <w:tcW w:type="dxa" w:w="1872"/>
-            <w:vAlign w:val="center"/>
-            <w:tcBorders>
-              <w:top w:val="single" w:sz="4" w:color="D9D9D9"/>
-              <w:left w:val="single" w:sz="4" w:color="D9D9D9"/>
-              <w:bottom w:val="single" w:sz="4" w:color="D9D9D9"/>
-              <w:right w:val="single" w:sz="4" w:color="D9D9D9"/>
-            </w:tcBorders>
-            <w:shd w:fill="E8EEF1"/>
-            <w:tcMar>
-              <w:top w:w="90" w:type="dxa"/>
-              <w:left w:w="90" w:type="dxa"/>
-              <w:bottom w:w="90" w:type="dxa"/>
-              <w:right w:w="90" w:type="dxa"/>
-            </w:tcMar>
+            <w:tcW w:type="dxa" w:w="1863"/>
           </w:tcPr>
           <w:p>
-            <w:pPr>
-              <w:spacing w:line="264" w:lineRule="auto" w:after="60" w:before="60"/>
-            </w:pPr>
             <w:r>
               <w:rPr>
                 <w:b/>
-                <w:sz w:val="18"/>
+                <w:sz w:val="16"/>
               </w:rPr>
               <w:t>Responsable propuesto</w:t>
             </w:r>
@@ -959,30 +906,13 @@
         </w:tc>
         <w:tc>
           <w:tcPr>
-            <w:tcW w:type="dxa" w:w="1368"/>
-            <w:vAlign w:val="center"/>
-            <w:tcBorders>
-              <w:top w:val="single" w:sz="4" w:color="D9D9D9"/>
-              <w:left w:val="single" w:sz="4" w:color="D9D9D9"/>
-              <w:bottom w:val="single" w:sz="4" w:color="D9D9D9"/>
-              <w:right w:val="single" w:sz="4" w:color="D9D9D9"/>
-            </w:tcBorders>
-            <w:shd w:fill="E8EEF1"/>
-            <w:tcMar>
-              <w:top w:w="90" w:type="dxa"/>
-              <w:left w:w="90" w:type="dxa"/>
-              <w:bottom w:w="90" w:type="dxa"/>
-              <w:right w:w="90" w:type="dxa"/>
-            </w:tcMar>
+            <w:tcW w:type="dxa" w:w="1863"/>
           </w:tcPr>
           <w:p>
-            <w:pPr>
-              <w:spacing w:line="264" w:lineRule="auto" w:after="60" w:before="60"/>
-            </w:pPr>
             <w:r>
               <w:rPr>
                 <w:b/>
-                <w:sz w:val="18"/>
+                <w:sz w:val="16"/>
               </w:rPr>
               <w:t>Plazo orientativo</w:t>
             </w:r>
@@ -990,65 +920,29 @@
         </w:tc>
         <w:tc>
           <w:tcPr>
-            <w:tcW w:type="dxa" w:w="1973"/>
-            <w:vAlign w:val="center"/>
-            <w:tcBorders>
-              <w:top w:val="single" w:sz="4" w:color="D9D9D9"/>
-              <w:left w:val="single" w:sz="4" w:color="D9D9D9"/>
-              <w:bottom w:val="single" w:sz="4" w:color="D9D9D9"/>
-              <w:right w:val="single" w:sz="4" w:color="D9D9D9"/>
-            </w:tcBorders>
-            <w:shd w:fill="E8EEF1"/>
-            <w:tcMar>
-              <w:top w:w="90" w:type="dxa"/>
-              <w:left w:w="90" w:type="dxa"/>
-              <w:bottom w:w="90" w:type="dxa"/>
-              <w:right w:w="90" w:type="dxa"/>
-            </w:tcMar>
+            <w:tcW w:type="dxa" w:w="1863"/>
           </w:tcPr>
           <w:p>
-            <w:pPr>
-              <w:spacing w:line="264" w:lineRule="auto" w:after="60" w:before="60"/>
-            </w:pPr>
             <w:r>
               <w:rPr>
                 <w:b/>
-                <w:sz w:val="18"/>
+                <w:sz w:val="16"/>
               </w:rPr>
-              <w:t>Evidencia de ejecución</w:t>
+              <w:t>Evidencia de cumplimiento</w:t>
             </w:r>
           </w:p>
         </w:tc>
       </w:tr>
       <w:tr>
-        <w:trPr>
-          <w:cantSplit/>
-        </w:trPr>
         <w:tc>
           <w:tcPr>
-            <w:tcW w:type="dxa" w:w="1512"/>
-            <w:vAlign w:val="center"/>
-            <w:tcBorders>
-              <w:top w:val="single" w:sz="4" w:color="D9D9D9"/>
-              <w:left w:val="single" w:sz="4" w:color="D9D9D9"/>
-              <w:bottom w:val="single" w:sz="4" w:color="D9D9D9"/>
-              <w:right w:val="single" w:sz="4" w:color="D9D9D9"/>
-            </w:tcBorders>
-            <w:shd w:fill="FFFFFF"/>
-            <w:tcMar>
-              <w:top w:w="90" w:type="dxa"/>
-              <w:left w:w="90" w:type="dxa"/>
-              <w:bottom w:w="90" w:type="dxa"/>
-              <w:right w:w="90" w:type="dxa"/>
-            </w:tcMar>
+            <w:tcW w:type="dxa" w:w="1863"/>
           </w:tcPr>
           <w:p>
-            <w:pPr>
-              <w:spacing w:line="264" w:lineRule="auto" w:after="60" w:before="60"/>
-            </w:pPr>
             <w:r>
               <w:rPr>
-                <w:sz w:val="18"/>
+                <w:b w:val="0"/>
+                <w:sz w:val="16"/>
               </w:rPr>
               <w:t>Formación y capital humano</w:t>
             </w:r>
@@ -1056,154 +950,71 @@
         </w:tc>
         <w:tc>
           <w:tcPr>
-            <w:tcW w:type="dxa" w:w="2592"/>
-            <w:vAlign w:val="center"/>
-            <w:tcBorders>
-              <w:top w:val="single" w:sz="4" w:color="D9D9D9"/>
-              <w:left w:val="single" w:sz="4" w:color="D9D9D9"/>
-              <w:bottom w:val="single" w:sz="4" w:color="D9D9D9"/>
-              <w:right w:val="single" w:sz="4" w:color="D9D9D9"/>
-            </w:tcBorders>
-            <w:shd w:fill="FFFFFF"/>
-            <w:tcMar>
-              <w:top w:w="90" w:type="dxa"/>
-              <w:left w:w="90" w:type="dxa"/>
-              <w:bottom w:w="90" w:type="dxa"/>
-              <w:right w:w="90" w:type="dxa"/>
-            </w:tcMar>
+            <w:tcW w:type="dxa" w:w="1863"/>
           </w:tcPr>
           <w:p>
-            <w:pPr>
-              <w:spacing w:line="264" w:lineRule="auto" w:after="60" w:before="60"/>
-            </w:pPr>
             <w:r>
               <w:rPr>
-                <w:sz w:val="18"/>
+                <w:b w:val="0"/>
+                <w:sz w:val="16"/>
               </w:rPr>
-              <w:t>Identificar perfiles de obra y gestión; acordar prácticas remuneradas y formación con un centro técnico local</w:t>
+              <w:t>Identificar puestos de obra, mantenimiento y gestión; acordar formación y prácticas remuneradas con un centro técnico local. Responde a la debilidad del empleo formal.</w:t>
             </w:r>
           </w:p>
         </w:tc>
         <w:tc>
           <w:tcPr>
-            <w:tcW w:type="dxa" w:w="1872"/>
-            <w:vAlign w:val="center"/>
-            <w:tcBorders>
-              <w:top w:val="single" w:sz="4" w:color="D9D9D9"/>
-              <w:left w:val="single" w:sz="4" w:color="D9D9D9"/>
-              <w:bottom w:val="single" w:sz="4" w:color="D9D9D9"/>
-              <w:right w:val="single" w:sz="4" w:color="D9D9D9"/>
-            </w:tcBorders>
-            <w:shd w:fill="FFFFFF"/>
-            <w:tcMar>
-              <w:top w:w="90" w:type="dxa"/>
-              <w:left w:w="90" w:type="dxa"/>
-              <w:bottom w:w="90" w:type="dxa"/>
-              <w:right w:w="90" w:type="dxa"/>
-            </w:tcMar>
+            <w:tcW w:type="dxa" w:w="1863"/>
           </w:tcPr>
           <w:p>
-            <w:pPr>
-              <w:spacing w:line="264" w:lineRule="auto" w:after="60" w:before="60"/>
-            </w:pPr>
             <w:r>
               <w:rPr>
-                <w:sz w:val="18"/>
+                <w:b w:val="0"/>
+                <w:sz w:val="16"/>
               </w:rPr>
-              <w:t>Promotor, contratista y centro formativo seleccionado</w:t>
+              <w:t>Acorn como promotor propuesto, contratista y centro técnico seleccionado</w:t>
             </w:r>
           </w:p>
         </w:tc>
         <w:tc>
           <w:tcPr>
-            <w:tcW w:type="dxa" w:w="1368"/>
-            <w:vAlign w:val="center"/>
-            <w:tcBorders>
-              <w:top w:val="single" w:sz="4" w:color="D9D9D9"/>
-              <w:left w:val="single" w:sz="4" w:color="D9D9D9"/>
-              <w:bottom w:val="single" w:sz="4" w:color="D9D9D9"/>
-              <w:right w:val="single" w:sz="4" w:color="D9D9D9"/>
-            </w:tcBorders>
-            <w:shd w:fill="FFFFFF"/>
-            <w:tcMar>
-              <w:top w:w="90" w:type="dxa"/>
-              <w:left w:w="90" w:type="dxa"/>
-              <w:bottom w:w="90" w:type="dxa"/>
-              <w:right w:w="90" w:type="dxa"/>
-            </w:tcMar>
+            <w:tcW w:type="dxa" w:w="1863"/>
           </w:tcPr>
           <w:p>
-            <w:pPr>
-              <w:spacing w:line="264" w:lineRule="auto" w:after="60" w:before="60"/>
-            </w:pPr>
             <w:r>
               <w:rPr>
-                <w:sz w:val="18"/>
+                <w:b w:val="0"/>
+                <w:sz w:val="16"/>
               </w:rPr>
-              <w:t>Diseño en meses 0–6; ejecución durante obra y operación</w:t>
+              <w:t>Definir perfiles y convenio en meses 0–6; ejecutar durante obra y operación</w:t>
             </w:r>
           </w:p>
         </w:tc>
         <w:tc>
           <w:tcPr>
-            <w:tcW w:type="dxa" w:w="1973"/>
-            <w:vAlign w:val="center"/>
-            <w:tcBorders>
-              <w:top w:val="single" w:sz="4" w:color="D9D9D9"/>
-              <w:left w:val="single" w:sz="4" w:color="D9D9D9"/>
-              <w:bottom w:val="single" w:sz="4" w:color="D9D9D9"/>
-              <w:right w:val="single" w:sz="4" w:color="D9D9D9"/>
-            </w:tcBorders>
-            <w:shd w:fill="FFFFFF"/>
-            <w:tcMar>
-              <w:top w:w="90" w:type="dxa"/>
-              <w:left w:w="90" w:type="dxa"/>
-              <w:bottom w:w="90" w:type="dxa"/>
-              <w:right w:w="90" w:type="dxa"/>
-            </w:tcMar>
+            <w:tcW w:type="dxa" w:w="1863"/>
           </w:tcPr>
           <w:p>
-            <w:pPr>
-              <w:spacing w:line="264" w:lineRule="auto" w:after="60" w:before="60"/>
-            </w:pPr>
             <w:r>
               <w:rPr>
-                <w:sz w:val="18"/>
+                <w:b w:val="0"/>
+                <w:sz w:val="16"/>
               </w:rPr>
-              <w:t>Personas formadas, certificaciones, contratación y continuidad laboral</w:t>
+              <w:t>Convenio firmado; personas formadas y contratadas; seguimiento de continuidad laboral</w:t>
             </w:r>
           </w:p>
         </w:tc>
       </w:tr>
       <w:tr>
-        <w:trPr>
-          <w:cantSplit/>
-        </w:trPr>
         <w:tc>
           <w:tcPr>
-            <w:tcW w:type="dxa" w:w="1512"/>
-            <w:vAlign w:val="center"/>
-            <w:tcBorders>
-              <w:top w:val="single" w:sz="4" w:color="D9D9D9"/>
-              <w:left w:val="single" w:sz="4" w:color="D9D9D9"/>
-              <w:bottom w:val="single" w:sz="4" w:color="D9D9D9"/>
-              <w:right w:val="single" w:sz="4" w:color="D9D9D9"/>
-            </w:tcBorders>
-            <w:shd w:fill="F6F8F9"/>
-            <w:tcMar>
-              <w:top w:w="90" w:type="dxa"/>
-              <w:left w:w="90" w:type="dxa"/>
-              <w:bottom w:w="90" w:type="dxa"/>
-              <w:right w:w="90" w:type="dxa"/>
-            </w:tcMar>
+            <w:tcW w:type="dxa" w:w="1863"/>
           </w:tcPr>
           <w:p>
-            <w:pPr>
-              <w:spacing w:line="264" w:lineRule="auto" w:after="60" w:before="60"/>
-            </w:pPr>
             <w:r>
               <w:rPr>
-                <w:sz w:val="18"/>
+                <w:b w:val="0"/>
+                <w:sz w:val="16"/>
               </w:rPr>
               <w:t>Marco legislativo y regulatorio</w:t>
             </w:r>
@@ -1211,309 +1022,143 @@
         </w:tc>
         <w:tc>
           <w:tcPr>
-            <w:tcW w:type="dxa" w:w="2592"/>
-            <w:vAlign w:val="center"/>
-            <w:tcBorders>
-              <w:top w:val="single" w:sz="4" w:color="D9D9D9"/>
-              <w:left w:val="single" w:sz="4" w:color="D9D9D9"/>
-              <w:bottom w:val="single" w:sz="4" w:color="D9D9D9"/>
-              <w:right w:val="single" w:sz="4" w:color="D9D9D9"/>
-            </w:tcBorders>
-            <w:shd w:fill="F6F8F9"/>
-            <w:tcMar>
-              <w:top w:w="90" w:type="dxa"/>
-              <w:left w:w="90" w:type="dxa"/>
-              <w:bottom w:w="90" w:type="dxa"/>
-              <w:right w:w="90" w:type="dxa"/>
-            </w:tcMar>
+            <w:tcW w:type="dxa" w:w="1863"/>
           </w:tcPr>
           <w:p>
-            <w:pPr>
-              <w:spacing w:line="264" w:lineRule="auto" w:after="60" w:before="60"/>
-            </w:pPr>
             <w:r>
               <w:rPr>
-                <w:sz w:val="18"/>
+                <w:b w:val="0"/>
+                <w:sz w:val="16"/>
               </w:rPr>
-              <w:t>Revisar título, uso permitido, estructura de inversión y permisos; preparar contrato y cargos comprensibles</w:t>
+              <w:t>Revisar título, duración del derecho sobre el suelo, uso permitido y estructura de inversión; elaborar contratos con cargos comprensibles y registrar permisos. Responde a los problemas de seguridad jurídica y gobernanza.</w:t>
             </w:r>
           </w:p>
         </w:tc>
         <w:tc>
           <w:tcPr>
-            <w:tcW w:type="dxa" w:w="1872"/>
-            <w:vAlign w:val="center"/>
-            <w:tcBorders>
-              <w:top w:val="single" w:sz="4" w:color="D9D9D9"/>
-              <w:left w:val="single" w:sz="4" w:color="D9D9D9"/>
-              <w:bottom w:val="single" w:sz="4" w:color="D9D9D9"/>
-              <w:right w:val="single" w:sz="4" w:color="D9D9D9"/>
-            </w:tcBorders>
-            <w:shd w:fill="F6F8F9"/>
-            <w:tcMar>
-              <w:top w:w="90" w:type="dxa"/>
-              <w:left w:w="90" w:type="dxa"/>
-              <w:bottom w:w="90" w:type="dxa"/>
-              <w:right w:w="90" w:type="dxa"/>
-            </w:tcMar>
+            <w:tcW w:type="dxa" w:w="1863"/>
           </w:tcPr>
           <w:p>
-            <w:pPr>
-              <w:spacing w:line="264" w:lineRule="auto" w:after="60" w:before="60"/>
-            </w:pPr>
             <w:r>
               <w:rPr>
-                <w:sz w:val="18"/>
+                <w:b w:val="0"/>
+                <w:sz w:val="16"/>
               </w:rPr>
-              <w:t>Asesoría local, promotor y autoridades competentes</w:t>
+              <w:t>Asesoría jurídica local, sociedad promotora y autoridades competentes del condado de Nairobi</w:t>
             </w:r>
           </w:p>
         </w:tc>
         <w:tc>
           <w:tcPr>
-            <w:tcW w:type="dxa" w:w="1368"/>
-            <w:vAlign w:val="center"/>
-            <w:tcBorders>
-              <w:top w:val="single" w:sz="4" w:color="D9D9D9"/>
-              <w:left w:val="single" w:sz="4" w:color="D9D9D9"/>
-              <w:bottom w:val="single" w:sz="4" w:color="D9D9D9"/>
-              <w:right w:val="single" w:sz="4" w:color="D9D9D9"/>
-            </w:tcBorders>
-            <w:shd w:fill="F6F8F9"/>
-            <w:tcMar>
-              <w:top w:w="90" w:type="dxa"/>
-              <w:left w:w="90" w:type="dxa"/>
-              <w:bottom w:w="90" w:type="dxa"/>
-              <w:right w:w="90" w:type="dxa"/>
-            </w:tcMar>
+            <w:tcW w:type="dxa" w:w="1863"/>
           </w:tcPr>
           <w:p>
-            <w:pPr>
-              <w:spacing w:line="264" w:lineRule="auto" w:after="60" w:before="60"/>
-            </w:pPr>
             <w:r>
               <w:rPr>
-                <w:sz w:val="18"/>
+                <w:b w:val="0"/>
+                <w:sz w:val="16"/>
               </w:rPr>
-              <w:t>Comprobaciones iniciales en meses 0–6; autorizaciones antes de cada fase</w:t>
+              <w:t>Revisión inicial en meses 0–6; autorizaciones antes de cada fase</w:t>
             </w:r>
           </w:p>
         </w:tc>
         <w:tc>
           <w:tcPr>
-            <w:tcW w:type="dxa" w:w="1973"/>
-            <w:vAlign w:val="center"/>
-            <w:tcBorders>
-              <w:top w:val="single" w:sz="4" w:color="D9D9D9"/>
-              <w:left w:val="single" w:sz="4" w:color="D9D9D9"/>
-              <w:bottom w:val="single" w:sz="4" w:color="D9D9D9"/>
-              <w:right w:val="single" w:sz="4" w:color="D9D9D9"/>
-            </w:tcBorders>
-            <w:shd w:fill="F6F8F9"/>
-            <w:tcMar>
-              <w:top w:w="90" w:type="dxa"/>
-              <w:left w:w="90" w:type="dxa"/>
-              <w:bottom w:w="90" w:type="dxa"/>
-              <w:right w:w="90" w:type="dxa"/>
-            </w:tcMar>
+            <w:tcW w:type="dxa" w:w="1863"/>
           </w:tcPr>
           <w:p>
-            <w:pPr>
-              <w:spacing w:line="264" w:lineRule="auto" w:after="60" w:before="60"/>
-            </w:pPr>
             <w:r>
               <w:rPr>
-                <w:sz w:val="18"/>
+                <w:b w:val="0"/>
+                <w:sz w:val="16"/>
               </w:rPr>
-              <w:t>Documentación validada y registro de solicitudes y resoluciones</w:t>
+              <w:t>Informe jurídico; título y uso comprobados; resoluciones administrativas; contratos revisados</w:t>
             </w:r>
           </w:p>
         </w:tc>
       </w:tr>
       <w:tr>
-        <w:trPr>
-          <w:cantSplit/>
-        </w:trPr>
         <w:tc>
           <w:tcPr>
-            <w:tcW w:type="dxa" w:w="1512"/>
-            <w:vAlign w:val="center"/>
-            <w:tcBorders>
-              <w:top w:val="single" w:sz="4" w:color="D9D9D9"/>
-              <w:left w:val="single" w:sz="4" w:color="D9D9D9"/>
-              <w:bottom w:val="single" w:sz="4" w:color="D9D9D9"/>
-              <w:right w:val="single" w:sz="4" w:color="D9D9D9"/>
-            </w:tcBorders>
-            <w:shd w:fill="FFFFFF"/>
-            <w:tcMar>
-              <w:top w:w="90" w:type="dxa"/>
-              <w:left w:w="90" w:type="dxa"/>
-              <w:bottom w:w="90" w:type="dxa"/>
-              <w:right w:w="90" w:type="dxa"/>
-            </w:tcMar>
+            <w:tcW w:type="dxa" w:w="1863"/>
           </w:tcPr>
           <w:p>
-            <w:pPr>
-              <w:spacing w:line="264" w:lineRule="auto" w:after="60" w:before="60"/>
-            </w:pPr>
             <w:r>
               <w:rPr>
-                <w:sz w:val="18"/>
+                <w:b w:val="0"/>
+                <w:sz w:val="16"/>
               </w:rPr>
-              <w:t>Infraestructura</w:t>
+              <w:t>Infraestructura y clima</w:t>
             </w:r>
           </w:p>
         </w:tc>
         <w:tc>
           <w:tcPr>
-            <w:tcW w:type="dxa" w:w="2592"/>
-            <w:vAlign w:val="center"/>
-            <w:tcBorders>
-              <w:top w:val="single" w:sz="4" w:color="D9D9D9"/>
-              <w:left w:val="single" w:sz="4" w:color="D9D9D9"/>
-              <w:bottom w:val="single" w:sz="4" w:color="D9D9D9"/>
-              <w:right w:val="single" w:sz="4" w:color="D9D9D9"/>
-            </w:tcBorders>
-            <w:shd w:fill="FFFFFF"/>
-            <w:tcMar>
-              <w:top w:w="90" w:type="dxa"/>
-              <w:left w:w="90" w:type="dxa"/>
-              <w:bottom w:w="90" w:type="dxa"/>
-              <w:right w:w="90" w:type="dxa"/>
-            </w:tcMar>
+            <w:tcW w:type="dxa" w:w="1863"/>
           </w:tcPr>
           <w:p>
-            <w:pPr>
-              <w:spacing w:line="264" w:lineRule="auto" w:after="60" w:before="60"/>
-            </w:pPr>
             <w:r>
               <w:rPr>
-                <w:sz w:val="18"/>
+                <w:b w:val="0"/>
+                <w:sz w:val="16"/>
               </w:rPr>
-              <w:t>Comparar parcelas por agua, saneamiento, drenaje, energía y transporte; definir conexiones y mantenimiento</w:t>
+              <w:t>Comparar parcelas por agua, saneamiento, drenaje, electricidad, transporte y seguridad peatonal; descartar ubicaciones sin soluciones técnicas y financieras viables. Responde a los riesgos climáticos y a las carencias de servicios.</w:t>
             </w:r>
           </w:p>
         </w:tc>
         <w:tc>
           <w:tcPr>
-            <w:tcW w:type="dxa" w:w="1872"/>
-            <w:vAlign w:val="center"/>
-            <w:tcBorders>
-              <w:top w:val="single" w:sz="4" w:color="D9D9D9"/>
-              <w:left w:val="single" w:sz="4" w:color="D9D9D9"/>
-              <w:bottom w:val="single" w:sz="4" w:color="D9D9D9"/>
-              <w:right w:val="single" w:sz="4" w:color="D9D9D9"/>
-            </w:tcBorders>
-            <w:shd w:fill="FFFFFF"/>
-            <w:tcMar>
-              <w:top w:w="90" w:type="dxa"/>
-              <w:left w:w="90" w:type="dxa"/>
-              <w:bottom w:w="90" w:type="dxa"/>
-              <w:right w:w="90" w:type="dxa"/>
-            </w:tcMar>
+            <w:tcW w:type="dxa" w:w="1863"/>
           </w:tcPr>
           <w:p>
-            <w:pPr>
-              <w:spacing w:line="264" w:lineRule="auto" w:after="60" w:before="60"/>
-            </w:pPr>
             <w:r>
               <w:rPr>
-                <w:sz w:val="18"/>
+                <w:b w:val="0"/>
+                <w:sz w:val="16"/>
               </w:rPr>
-              <w:t>Equipo técnico, operadores de servicios y condado</w:t>
+              <w:t>Equipo técnico de Acorn, operadores de servicios y condado de Nairobi</w:t>
             </w:r>
           </w:p>
         </w:tc>
         <w:tc>
           <w:tcPr>
-            <w:tcW w:type="dxa" w:w="1368"/>
-            <w:vAlign w:val="center"/>
-            <w:tcBorders>
-              <w:top w:val="single" w:sz="4" w:color="D9D9D9"/>
-              <w:left w:val="single" w:sz="4" w:color="D9D9D9"/>
-              <w:bottom w:val="single" w:sz="4" w:color="D9D9D9"/>
-              <w:right w:val="single" w:sz="4" w:color="D9D9D9"/>
-            </w:tcBorders>
-            <w:shd w:fill="FFFFFF"/>
-            <w:tcMar>
-              <w:top w:w="90" w:type="dxa"/>
-              <w:left w:w="90" w:type="dxa"/>
-              <w:bottom w:w="90" w:type="dxa"/>
-              <w:right w:w="90" w:type="dxa"/>
-            </w:tcMar>
+            <w:tcW w:type="dxa" w:w="1863"/>
           </w:tcPr>
           <w:p>
-            <w:pPr>
-              <w:spacing w:line="264" w:lineRule="auto" w:after="60" w:before="60"/>
-            </w:pPr>
             <w:r>
               <w:rPr>
-                <w:sz w:val="18"/>
+                <w:b w:val="0"/>
+                <w:sz w:val="16"/>
               </w:rPr>
-              <w:t>Evaluación en meses 0–6; acuerdos antes de obra</w:t>
+              <w:t>Evaluación en meses 0–6; soluciones y costes definidos antes de aprobar la obra</w:t>
             </w:r>
           </w:p>
         </w:tc>
         <w:tc>
           <w:tcPr>
-            <w:tcW w:type="dxa" w:w="1973"/>
-            <w:vAlign w:val="center"/>
-            <w:tcBorders>
-              <w:top w:val="single" w:sz="4" w:color="D9D9D9"/>
-              <w:left w:val="single" w:sz="4" w:color="D9D9D9"/>
-              <w:bottom w:val="single" w:sz="4" w:color="D9D9D9"/>
-              <w:right w:val="single" w:sz="4" w:color="D9D9D9"/>
-            </w:tcBorders>
-            <w:shd w:fill="FFFFFF"/>
-            <w:tcMar>
-              <w:top w:w="90" w:type="dxa"/>
-              <w:left w:w="90" w:type="dxa"/>
-              <w:bottom w:w="90" w:type="dxa"/>
-              <w:right w:w="90" w:type="dxa"/>
-            </w:tcMar>
+            <w:tcW w:type="dxa" w:w="1863"/>
           </w:tcPr>
           <w:p>
-            <w:pPr>
-              <w:spacing w:line="264" w:lineRule="auto" w:after="60" w:before="60"/>
-            </w:pPr>
             <w:r>
               <w:rPr>
-                <w:sz w:val="18"/>
+                <w:b w:val="0"/>
+                <w:sz w:val="16"/>
               </w:rPr>
-              <w:t>Costes de conexión, continuidad prevista y verificación técnica</w:t>
+              <w:t>Informe de parcela; evaluación de drenaje; costes y condiciones de conexión documentados</w:t>
             </w:r>
           </w:p>
         </w:tc>
       </w:tr>
       <w:tr>
-        <w:trPr>
-          <w:cantSplit/>
-        </w:trPr>
         <w:tc>
           <w:tcPr>
-            <w:tcW w:type="dxa" w:w="1512"/>
-            <w:vAlign w:val="center"/>
-            <w:tcBorders>
-              <w:top w:val="single" w:sz="4" w:color="D9D9D9"/>
-              <w:left w:val="single" w:sz="4" w:color="D9D9D9"/>
-              <w:bottom w:val="single" w:sz="4" w:color="D9D9D9"/>
-              <w:right w:val="single" w:sz="4" w:color="D9D9D9"/>
-            </w:tcBorders>
-            <w:shd w:fill="F6F8F9"/>
-            <w:tcMar>
-              <w:top w:w="90" w:type="dxa"/>
-              <w:left w:w="90" w:type="dxa"/>
-              <w:bottom w:w="90" w:type="dxa"/>
-              <w:right w:w="90" w:type="dxa"/>
-            </w:tcMar>
+            <w:tcW w:type="dxa" w:w="1863"/>
           </w:tcPr>
           <w:p>
-            <w:pPr>
-              <w:spacing w:line="264" w:lineRule="auto" w:after="60" w:before="60"/>
-            </w:pPr>
             <w:r>
               <w:rPr>
-                <w:sz w:val="18"/>
+                <w:b w:val="0"/>
+                <w:sz w:val="16"/>
               </w:rPr>
               <w:t>Incentivos administrativos</w:t>
             </w:r>
@@ -1521,154 +1166,143 @@
         </w:tc>
         <w:tc>
           <w:tcPr>
-            <w:tcW w:type="dxa" w:w="2592"/>
-            <w:vAlign w:val="center"/>
-            <w:tcBorders>
-              <w:top w:val="single" w:sz="4" w:color="D9D9D9"/>
-              <w:left w:val="single" w:sz="4" w:color="D9D9D9"/>
-              <w:bottom w:val="single" w:sz="4" w:color="D9D9D9"/>
-              <w:right w:val="single" w:sz="4" w:color="D9D9D9"/>
-            </w:tcBorders>
-            <w:shd w:fill="F6F8F9"/>
-            <w:tcMar>
-              <w:top w:w="90" w:type="dxa"/>
-              <w:left w:w="90" w:type="dxa"/>
-              <w:bottom w:w="90" w:type="dxa"/>
-              <w:right w:w="90" w:type="dxa"/>
-            </w:tcMar>
+            <w:tcW w:type="dxa" w:w="1863"/>
           </w:tcPr>
           <w:p>
-            <w:pPr>
-              <w:spacing w:line="264" w:lineRule="auto" w:after="60" w:before="60"/>
-            </w:pPr>
             <w:r>
               <w:rPr>
-                <w:sz w:val="18"/>
+                <w:b w:val="0"/>
+                <w:sz w:val="16"/>
               </w:rPr>
-              <w:t>Solicitar coordinación de trámites e información pública de requisitos, sin eximir controles ni presuponer ventajas fiscales</w:t>
+              <w:t>Solicitar coordinación de trámites e información clara de requisitos y tasas. Se elige esta vía frente a exenciones fiscales generales por las restricciones fiscales del país.</w:t>
             </w:r>
           </w:p>
         </w:tc>
         <w:tc>
           <w:tcPr>
-            <w:tcW w:type="dxa" w:w="1872"/>
-            <w:vAlign w:val="center"/>
-            <w:tcBorders>
-              <w:top w:val="single" w:sz="4" w:color="D9D9D9"/>
-              <w:left w:val="single" w:sz="4" w:color="D9D9D9"/>
-              <w:bottom w:val="single" w:sz="4" w:color="D9D9D9"/>
-              <w:right w:val="single" w:sz="4" w:color="D9D9D9"/>
-            </w:tcBorders>
-            <w:shd w:fill="F6F8F9"/>
-            <w:tcMar>
-              <w:top w:w="90" w:type="dxa"/>
-              <w:left w:w="90" w:type="dxa"/>
-              <w:bottom w:w="90" w:type="dxa"/>
-              <w:right w:w="90" w:type="dxa"/>
-            </w:tcMar>
+            <w:tcW w:type="dxa" w:w="1863"/>
           </w:tcPr>
           <w:p>
-            <w:pPr>
-              <w:spacing w:line="264" w:lineRule="auto" w:after="60" w:before="60"/>
-            </w:pPr>
             <w:r>
               <w:rPr>
-                <w:sz w:val="18"/>
+                <w:b w:val="0"/>
+                <w:sz w:val="16"/>
               </w:rPr>
-              <w:t>Promotor, Invest Kenya y condado</w:t>
+              <w:t>Promotor, Invest Kenya y condado de Nairobi</w:t>
             </w:r>
           </w:p>
         </w:tc>
         <w:tc>
           <w:tcPr>
-            <w:tcW w:type="dxa" w:w="1368"/>
-            <w:vAlign w:val="center"/>
-            <w:tcBorders>
-              <w:top w:val="single" w:sz="4" w:color="D9D9D9"/>
-              <w:left w:val="single" w:sz="4" w:color="D9D9D9"/>
-              <w:bottom w:val="single" w:sz="4" w:color="D9D9D9"/>
-              <w:right w:val="single" w:sz="4" w:color="D9D9D9"/>
-            </w:tcBorders>
-            <w:shd w:fill="F6F8F9"/>
-            <w:tcMar>
-              <w:top w:w="90" w:type="dxa"/>
-              <w:left w:w="90" w:type="dxa"/>
-              <w:bottom w:w="90" w:type="dxa"/>
-              <w:right w:w="90" w:type="dxa"/>
-            </w:tcMar>
+            <w:tcW w:type="dxa" w:w="1863"/>
           </w:tcPr>
           <w:p>
-            <w:pPr>
-              <w:spacing w:line="264" w:lineRule="auto" w:after="60" w:before="60"/>
-            </w:pPr>
             <w:r>
               <w:rPr>
-                <w:sz w:val="18"/>
+                <w:b w:val="0"/>
+                <w:sz w:val="16"/>
               </w:rPr>
-              <w:t>Durante preparación y autorizaciones</w:t>
+              <w:t>Iniciar en meses 0–3 y mantener durante las autorizaciones</w:t>
             </w:r>
           </w:p>
         </w:tc>
         <w:tc>
           <w:tcPr>
-            <w:tcW w:type="dxa" w:w="1973"/>
-            <w:vAlign w:val="center"/>
-            <w:tcBorders>
-              <w:top w:val="single" w:sz="4" w:color="D9D9D9"/>
-              <w:left w:val="single" w:sz="4" w:color="D9D9D9"/>
-              <w:bottom w:val="single" w:sz="4" w:color="D9D9D9"/>
-              <w:right w:val="single" w:sz="4" w:color="D9D9D9"/>
-            </w:tcBorders>
-            <w:shd w:fill="F6F8F9"/>
-            <w:tcMar>
-              <w:top w:w="90" w:type="dxa"/>
-              <w:left w:w="90" w:type="dxa"/>
-              <w:bottom w:w="90" w:type="dxa"/>
-              <w:right w:w="90" w:type="dxa"/>
-            </w:tcMar>
+            <w:tcW w:type="dxa" w:w="1863"/>
           </w:tcPr>
           <w:p>
-            <w:pPr>
-              <w:spacing w:line="264" w:lineRule="auto" w:after="60" w:before="60"/>
-            </w:pPr>
             <w:r>
               <w:rPr>
-                <w:sz w:val="18"/>
+                <w:b w:val="0"/>
+                <w:sz w:val="16"/>
               </w:rPr>
-              <w:t>Requisitos documentados, incidencias y tiempos observados</w:t>
+              <w:t>Registro de requisitos, solicitudes, incidencias y tiempos; coste de tasas identificado</w:t>
             </w:r>
           </w:p>
         </w:tc>
       </w:tr>
       <w:tr>
-        <w:trPr>
-          <w:cantSplit/>
-        </w:trPr>
         <w:tc>
           <w:tcPr>
-            <w:tcW w:type="dxa" w:w="1512"/>
-            <w:vAlign w:val="center"/>
-            <w:tcBorders>
-              <w:top w:val="single" w:sz="4" w:color="D9D9D9"/>
-              <w:left w:val="single" w:sz="4" w:color="D9D9D9"/>
-              <w:bottom w:val="single" w:sz="4" w:color="D9D9D9"/>
-              <w:right w:val="single" w:sz="4" w:color="D9D9D9"/>
-            </w:tcBorders>
-            <w:shd w:fill="FFFFFF"/>
-            <w:tcMar>
-              <w:top w:w="90" w:type="dxa"/>
-              <w:left w:w="90" w:type="dxa"/>
-              <w:bottom w:w="90" w:type="dxa"/>
-              <w:right w:w="90" w:type="dxa"/>
-            </w:tcMar>
+            <w:tcW w:type="dxa" w:w="1863"/>
           </w:tcPr>
           <w:p>
-            <w:pPr>
-              <w:spacing w:line="264" w:lineRule="auto" w:after="60" w:before="60"/>
-            </w:pPr>
             <w:r>
               <w:rPr>
-                <w:sz w:val="18"/>
+                <w:b w:val="0"/>
+                <w:sz w:val="16"/>
+              </w:rPr>
+              <w:t>Financiación y capacidad de pago</w:t>
+            </w:r>
+          </w:p>
+        </w:tc>
+        <w:tc>
+          <w:tcPr>
+            <w:tcW w:type="dxa" w:w="1863"/>
+          </w:tcPr>
+          <w:p>
+            <w:r>
+              <w:rPr>
+                <w:b w:val="0"/>
+                <w:sz w:val="16"/>
+              </w:rPr>
+              <w:t>Contrastar alquileres previstos con presupuestos de hogares y costes completos; evaluar menor ocupación, aumento de costes y riesgo cambiario. Responde a informalidad, inflación y dificultades de financiación.</w:t>
+            </w:r>
+          </w:p>
+        </w:tc>
+        <w:tc>
+          <w:tcPr>
+            <w:tcW w:type="dxa" w:w="1863"/>
+          </w:tcPr>
+          <w:p>
+            <w:r>
+              <w:rPr>
+                <w:b w:val="0"/>
+                <w:sz w:val="16"/>
+              </w:rPr>
+              <w:t>Acorn, inversores potenciales y asesoría financiera</w:t>
+            </w:r>
+          </w:p>
+        </w:tc>
+        <w:tc>
+          <w:tcPr>
+            <w:tcW w:type="dxa" w:w="1863"/>
+          </w:tcPr>
+          <w:p>
+            <w:r>
+              <w:rPr>
+                <w:b w:val="0"/>
+                <w:sz w:val="16"/>
+              </w:rPr>
+              <w:t>Estudio de hogares en meses 0–6; modelo financiero y decisión en meses 6–12</w:t>
+            </w:r>
+          </w:p>
+        </w:tc>
+        <w:tc>
+          <w:tcPr>
+            <w:tcW w:type="dxa" w:w="1863"/>
+          </w:tcPr>
+          <w:p>
+            <w:r>
+              <w:rPr>
+                <w:b w:val="0"/>
+                <w:sz w:val="16"/>
+              </w:rPr>
+              <w:t>Estudio de demanda; modelo con escenarios; estructura de financiación y condiciones de aprobación documentadas</w:t>
+            </w:r>
+          </w:p>
+        </w:tc>
+      </w:tr>
+      <w:tr>
+        <w:tc>
+          <w:tcPr>
+            <w:tcW w:type="dxa" w:w="1863"/>
+          </w:tcPr>
+          <w:p>
+            <w:r>
+              <w:rPr>
+                <w:b w:val="0"/>
+                <w:sz w:val="16"/>
               </w:rPr>
               <w:t>Gestión e impacto</w:t>
             </w:r>
@@ -1676,59 +1310,27 @@
         </w:tc>
         <w:tc>
           <w:tcPr>
-            <w:tcW w:type="dxa" w:w="2592"/>
-            <w:vAlign w:val="center"/>
-            <w:tcBorders>
-              <w:top w:val="single" w:sz="4" w:color="D9D9D9"/>
-              <w:left w:val="single" w:sz="4" w:color="D9D9D9"/>
-              <w:bottom w:val="single" w:sz="4" w:color="D9D9D9"/>
-              <w:right w:val="single" w:sz="4" w:color="D9D9D9"/>
-            </w:tcBorders>
-            <w:shd w:fill="FFFFFF"/>
-            <w:tcMar>
-              <w:top w:w="90" w:type="dxa"/>
-              <w:left w:w="90" w:type="dxa"/>
-              <w:bottom w:w="90" w:type="dxa"/>
-              <w:right w:w="90" w:type="dxa"/>
-            </w:tcMar>
+            <w:tcW w:type="dxa" w:w="1863"/>
           </w:tcPr>
           <w:p>
-            <w:pPr>
-              <w:spacing w:line="264" w:lineRule="auto" w:after="60" w:before="60"/>
-            </w:pPr>
             <w:r>
               <w:rPr>
-                <w:sz w:val="18"/>
+                <w:b w:val="0"/>
+                <w:sz w:val="16"/>
               </w:rPr>
-              <w:t>Establecer compras locales, atención al inquilino y evaluación del coste total de residencia</w:t>
+              <w:t>Implantar mantenimiento, registro de cobros digitales y canal de reclamaciones; comprobar compras locales, coste de residencia y posibles desplazamientos. Aprovecha capacidades digitales y aborda desigualdad y calidad del servicio.</w:t>
             </w:r>
           </w:p>
         </w:tc>
         <w:tc>
           <w:tcPr>
-            <w:tcW w:type="dxa" w:w="1872"/>
-            <w:vAlign w:val="center"/>
-            <w:tcBorders>
-              <w:top w:val="single" w:sz="4" w:color="D9D9D9"/>
-              <w:left w:val="single" w:sz="4" w:color="D9D9D9"/>
-              <w:bottom w:val="single" w:sz="4" w:color="D9D9D9"/>
-              <w:right w:val="single" w:sz="4" w:color="D9D9D9"/>
-            </w:tcBorders>
-            <w:shd w:fill="FFFFFF"/>
-            <w:tcMar>
-              <w:top w:w="90" w:type="dxa"/>
-              <w:left w:w="90" w:type="dxa"/>
-              <w:bottom w:w="90" w:type="dxa"/>
-              <w:right w:w="90" w:type="dxa"/>
-            </w:tcMar>
+            <w:tcW w:type="dxa" w:w="1863"/>
           </w:tcPr>
           <w:p>
-            <w:pPr>
-              <w:spacing w:line="264" w:lineRule="auto" w:after="60" w:before="60"/>
-            </w:pPr>
             <w:r>
               <w:rPr>
-                <w:sz w:val="18"/>
+                <w:b w:val="0"/>
+                <w:sz w:val="16"/>
               </w:rPr>
               <w:t>Promotor-operador y proveedores</w:t>
             </w:r>
@@ -1736,74 +1338,37 @@
         </w:tc>
         <w:tc>
           <w:tcPr>
-            <w:tcW w:type="dxa" w:w="1368"/>
-            <w:vAlign w:val="center"/>
-            <w:tcBorders>
-              <w:top w:val="single" w:sz="4" w:color="D9D9D9"/>
-              <w:left w:val="single" w:sz="4" w:color="D9D9D9"/>
-              <w:bottom w:val="single" w:sz="4" w:color="D9D9D9"/>
-              <w:right w:val="single" w:sz="4" w:color="D9D9D9"/>
-            </w:tcBorders>
-            <w:shd w:fill="FFFFFF"/>
-            <w:tcMar>
-              <w:top w:w="90" w:type="dxa"/>
-              <w:left w:w="90" w:type="dxa"/>
-              <w:bottom w:w="90" w:type="dxa"/>
-              <w:right w:w="90" w:type="dxa"/>
-            </w:tcMar>
+            <w:tcW w:type="dxa" w:w="1863"/>
           </w:tcPr>
           <w:p>
-            <w:pPr>
-              <w:spacing w:line="264" w:lineRule="auto" w:after="60" w:before="60"/>
-            </w:pPr>
             <w:r>
               <w:rPr>
-                <w:sz w:val="18"/>
+                <w:b w:val="0"/>
+                <w:sz w:val="16"/>
               </w:rPr>
-              <w:t>Desde la contratación; revisión tras apertura</w:t>
+              <w:t>Diseñar antes de abrir; revisar trimestralmente durante el primer año de operación</w:t>
             </w:r>
           </w:p>
         </w:tc>
         <w:tc>
           <w:tcPr>
-            <w:tcW w:type="dxa" w:w="1973"/>
-            <w:vAlign w:val="center"/>
-            <w:tcBorders>
-              <w:top w:val="single" w:sz="4" w:color="D9D9D9"/>
-              <w:left w:val="single" w:sz="4" w:color="D9D9D9"/>
-              <w:bottom w:val="single" w:sz="4" w:color="D9D9D9"/>
-              <w:right w:val="single" w:sz="4" w:color="D9D9D9"/>
-            </w:tcBorders>
-            <w:shd w:fill="FFFFFF"/>
-            <w:tcMar>
-              <w:top w:w="90" w:type="dxa"/>
-              <w:left w:w="90" w:type="dxa"/>
-              <w:bottom w:w="90" w:type="dxa"/>
-              <w:right w:w="90" w:type="dxa"/>
-            </w:tcMar>
+            <w:tcW w:type="dxa" w:w="1863"/>
           </w:tcPr>
           <w:p>
-            <w:pPr>
-              <w:spacing w:line="264" w:lineRule="auto" w:after="60" w:before="60"/>
-            </w:pPr>
             <w:r>
               <w:rPr>
-                <w:sz w:val="18"/>
+                <w:b w:val="0"/>
+                <w:sz w:val="16"/>
               </w:rPr>
-              <w:t>Compras locales, mantenimiento, reclamaciones y esfuerzo de pago</w:t>
+              <w:t>Registros de mantenimiento y reclamaciones; ocupación y cobros; compras locales; seguimiento del esfuerzo de pago</w:t>
             </w:r>
           </w:p>
         </w:tc>
       </w:tr>
     </w:tbl>
     <w:p>
-      <w:pPr>
-        <w:spacing w:after="0"/>
-      </w:pPr>
-    </w:p>
-    <w:p>
       <w:r>
-        <w:t>La carta de servicios del condado distingue aprobación de planos, inspecciones y certificado de ocupación. Cada función exige una comprobación distinta. La presentación de un expediente no sustituye las autorizaciones correspondientes; tampoco asegura que se cumplan los tiempos administrativos anunciados (Nairobi City County Government, 2025).</w:t>
+        <w:t>La coordinación administrativa no sustituye los controles. La aprobación de planos, las inspecciones y el certificado de ocupación son actuaciones distintas y deben verificarse por separado (Nairobi City County Government, 2025). El plan propone mejorar la preparación y el seguimiento de los expedientes; no atribuye al promotor capacidad para cambiar las normas ni garantiza plazos de resolución.</w:t>
       </w:r>
     </w:p>
     <w:p>
@@ -1811,27 +1376,27 @@
         <w:pStyle w:val="Heading2"/>
       </w:pPr>
       <w:r>
-        <w:t>6.4. Financiación, ejecución y condiciones para avanzar</w:t>
+        <w:t>6.4. Decisión de inversión y seguimiento</w:t>
       </w:r>
     </w:p>
     <w:p>
       <w:r>
-        <w:t>Antes de comprometer la construcción, el promotor deberá comparar ingresos de alquiler razonablemente sustentados con suelo, obra, financiación, mantenimiento, seguros, gestión y vacancia. La evaluación debe incluir menor ocupación, retrasos de entrega y aumento de costes. Si existen costes o deuda en divisas frente a alquileres en chelines, deberá explicarse cómo se limita ese desajuste. No se presupone disponibilidad de cobertura ni financiación concesional.</w:t>
+        <w:t>La primera decisión será seleccionar una parcela y un producto compatibles con los ingresos del público objetivo. La segunda será aprobar un diseño con servicios, costes y permisos comprobados. Solo después se negociará el cierre de la financiación y la contratación de la obra. En cada fase se podrá detener o reformular la operación si no cumple las condiciones mínimas.</w:t>
       </w:r>
     </w:p>
     <w:p>
       <w:r>
-        <w:t>Se recomienda avanzar por decisiones sucesivas: primero, demanda y parcelas; después, diseño, costes y permisos; finalmente, financiación y contratación. Cada fase debe tener una salida posible si el proyecto no alcanza sus condiciones mínimas. El acceso a servicios y la capacidad de pago serán condiciones de aprobación, no mejoras aplazadas hasta después de comercializar.</w:t>
+        <w:t>El modelo financiero incluirá suelo, construcción, financiación, mantenimiento, seguros, gestión y periodos sin ocupación. Se comprobará si el proyecto puede sostenerse con menor ocupación, retrasos y aumentos de costes. Cuando existan obligaciones en divisas, se documentará cómo se limita el desajuste con ingresos en chelines, sin presuponer que haya cobertura disponible.</w:t>
       </w:r>
     </w:p>
     <w:p>
       <w:r>
-        <w:t>Las restricciones presupuestarias del país justifican priorizar la coordinación administrativa frente a exenciones fiscales generales. Cualquier apoyo adicional tendría que identificar fundamento legal, coste y beneficiarios. La formación o una mejora ambiental solo justificarían apoyo si sus resultados son verificables y no se limitan a compromisos de marketing.</w:t>
+        <w:t>Antes de aprobar la construcción deberán quedar documentadas la seguridad jurídica de la parcela, la viabilidad de los servicios, una demanda compatible con el coste total de residencia y una financiación identificada. No se contará con exenciones fiscales o infraestructura pública sin respaldo confirmado. Las metas de ocupación, mantenimiento y esfuerzo de pago se fijarán con el estudio inicial y se incorporarán al seguimiento del operador.</w:t>
       </w:r>
     </w:p>
     <w:p>
       <w:r>
-        <w:t>El seguimiento combinará ocupación y cobro con calidad del servicio, resolución de reclamaciones y coste total para los residentes. Las metas se fijarán cuando exista línea de base. Se evaluará también si la actuación desplaza a ocupantes o actividades existentes: una mejora del inmueble que expulse al público al que se pretende atender contradiría la justificación del proyecto.</w:t>
+        <w:t>La apuesta final es impulsar alquiler de larga duración con Acorn como cabecera, Riruta como zona inicial de estudio y capital asociado a un operador local. El criterio para avanzar será que las capacidades empresariales se traduzcan en una operación sostenible y en mejores condiciones residenciales para los trabajadores. La rentabilidad, el servicio y el impacto sobre los residentes se evaluarán conjuntamente.</w:t>
       </w:r>
     </w:p>
     <w:p>

</xml_diff>

<commit_message>
Revisa el formato APA y la correspondencia entre citas y referencias
</commit_message>
<xml_diff>
--- a/trabajo_africa/documentos/Trabajo_Kenia_Cristina_Moro_APA.docx
+++ b/trabajo_africa/documentos/Trabajo_Kenia_Cristina_Moro_APA.docx
@@ -76,7 +76,7 @@
     </w:p>
     <w:p>
       <w:r>
-        <w:t>Para estudiar la capacidad de pago también hay que conocer los gastos y obligaciones del hogar. Se identifican restricciones de acceso a vivienda incluso entre personas vinculadas a fondos de pensiones (Shah, Zamara y Centre for Affordable Housing Finance in Africa, 2026). El cliente propuesto será, por ello, un hogar pequeño de trabajadores con ingresos documentables, sin presentar el proyecto como solución para toda la población de bajos ingresos.</w:t>
+        <w:t>Para estudiar la capacidad de pago también hay que conocer los gastos y obligaciones del hogar. Se identifican restricciones de acceso a vivienda incluso entre personas vinculadas a fondos de pensiones (Shah et al., 2026). El cliente propuesto será, por ello, un hogar pequeño de trabajadores con ingresos documentables, sin presentar el proyecto como solución para toda la población de bajos ingresos.</w:t>
       </w:r>
     </w:p>
     <w:p>
@@ -104,14 +104,8 @@
     </w:p>
     <w:p>
       <w:r>
-        <w:t>El contexto de inversión debe distinguir flujos anuales y capital acumulado. Las entradas de inversión extranjera directa en Kenia alcanzaron 1.503 millones de dólares en 2024, cifra redondeada a 1.500 millones en otra publicación del mismo organismo (UNCTAD, 2025a, 2025b). Se trata de flujos nacionales, no de recursos disponibles para vivienda.</w:t>
+        <w:t>El contexto de inversión debe distinguir flujos anuales y capital acumulado. Las entradas de inversión extranjera directa en Kenia alcanzaron 1.503 millones de dólares en 2024, cifra redondeada a 1.500 millones en otra publicación del mismo organismo (United Nations Conference on Trade and Development [UNCTAD], 2025a, 2025b). Se trata de flujos nacionales, no de recursos disponibles para vivienda.</w:t>
       </w:r>
-      <w:r>
-        <w:rPr>
-          <w:i/>
-        </w:rPr>
-      </w:r>
-      <w:r/>
     </w:p>
     <w:p>
       <w:r>
@@ -172,21 +166,15 @@
     </w:p>
     <w:p>
       <w:r>
-        <w:rPr>
-          <w:i w:val="0"/>
-        </w:rPr>
         <w:t>Estas reformas incluyeron privatizaciones y cambios en el empleo público y el gasto del Estado. Para valorar sus efectos, hay que estudiar cómo afectaron a los distintos grupos sociales. Una mejora de las cuentas públicas puede coexistir con dificultades de algunas familias para acceder a servicios básicos. Por eso, los indicadores económicos no bastan para conocer sus consecuencias sobre el bienestar (</w:t>
       </w:r>
       <w:r>
         <w:rPr>
           <w:i/>
         </w:rPr>
-        <w:t>Kenya National Human Development Report 2006</w:t>
+        <w:t>Kenya national human development report 2006</w:t>
       </w:r>
       <w:r>
-        <w:rPr>
-          <w:i w:val="0"/>
-        </w:rPr>
         <w:t>, 2006).</w:t>
       </w:r>
     </w:p>
@@ -354,22 +342,16 @@
     </w:p>
     <w:p>
       <w:r>
-        <w:rPr>
-          <w:i w:val="0"/>
-        </w:rPr>
-        <w:t xml:space="preserve">El marco de Acemoglu y Robinson, desarrollado en </w:t>
+        <w:t xml:space="preserve">El marco de Acemoglu y Robinson (2012), desarrollado en </w:t>
       </w:r>
       <w:r>
         <w:rPr>
           <w:i/>
         </w:rPr>
-        <w:t>Why Nations Fail</w:t>
+        <w:t>Why nations fail</w:t>
       </w:r>
       <w:r>
-        <w:rPr>
-          <w:i w:val="0"/>
-        </w:rPr>
-        <w:t xml:space="preserve"> (2012), permite relacionar estas etapas sin atribuir todos los resultados al colonialismo ni a una única reforma. El análisis considera mecanismos concretos: cuando obtener un título o un permiso depende de contactos y rentas, disminuye la competencia y se concentra el acceso al suelo; cuando las reglas son previsibles y exigibles, más actores pueden invertir y contratar.</w:t>
+        <w:t>, permite relacionar estas etapas sin atribuir todos los resultados al colonialismo ni a una única reforma. El análisis considera mecanismos concretos: cuando obtener un título o un permiso depende de contactos y rentas, disminuye la competencia y se concentra el acceso al suelo; cuando las reglas son previsibles y exigibles, más actores pueden invertir y contratar.</w:t>
       </w:r>
     </w:p>
     <w:p>
@@ -768,7 +750,7 @@
     </w:p>
     <w:p>
       <w:r>
-        <w:t>Las debilidades del DAFO determinan el diseño: la informalidad y las restricciones presupuestarias obligan a estudiar ingresos y gastos reales, y los problemas de gobernanza exigen revisar suelo y permisos. La existencia de ingresos recurrentes no elimina las dificultades de acceso a vivienda (Shah, Zamara y Centre for Affordable Housing Finance in Africa, 2026). Por ello, no se fija todavía una tarifa ni se presenta el producto como asequible para toda la población de bajos ingresos.</w:t>
+        <w:t>Las debilidades del DAFO determinan el diseño: la informalidad y las restricciones presupuestarias obligan a estudiar ingresos y gastos reales, y los problemas de gobernanza exigen revisar suelo y permisos. La existencia de ingresos recurrentes no elimina las dificultades de acceso a vivienda (Shah et al., 2026). Por ello, no se fija todavía una tarifa ni se presenta el producto como asequible para toda la población de bajos ingresos.</w:t>
       </w:r>
     </w:p>
     <w:p>
@@ -1437,586 +1419,606 @@
     </w:p>
     <w:p>
       <w:pPr>
-        <w:keepLines/>
-        <w:spacing w:line="288" w:lineRule="auto"/>
+        <w:spacing w:line="480" w:lineRule="auto" w:before="0" w:after="0"/>
         <w:ind w:left="720" w:hanging="720"/>
       </w:pPr>
       <w:r>
         <w:rPr>
-          <w:sz w:val="21"/>
+          <w:i w:val="0"/>
+          <w:sz w:val="22"/>
         </w:rPr>
         <w:t xml:space="preserve">Acemoglu, D., &amp; Robinson, J. A. (2012). </w:t>
       </w:r>
       <w:r>
         <w:rPr>
           <w:i/>
-          <w:sz w:val="21"/>
+          <w:sz w:val="22"/>
         </w:rPr>
         <w:t>Why nations fail: The origins of power, prosperity, and poverty</w:t>
       </w:r>
       <w:r>
         <w:rPr>
-          <w:sz w:val="21"/>
+          <w:i w:val="0"/>
+          <w:sz w:val="22"/>
         </w:rPr>
         <w:t>. Crown. https://www.penguinrandomhouseretail.com/book/?isbn=9780307719218</w:t>
       </w:r>
     </w:p>
     <w:p>
       <w:pPr>
-        <w:keepLines/>
-        <w:spacing w:line="288" w:lineRule="auto"/>
+        <w:spacing w:line="480" w:lineRule="auto" w:before="0" w:after="0"/>
         <w:ind w:left="720" w:hanging="720"/>
       </w:pPr>
       <w:r>
         <w:rPr>
-          <w:sz w:val="21"/>
+          <w:i w:val="0"/>
+          <w:sz w:val="22"/>
         </w:rPr>
-        <w:t xml:space="preserve">Acorn Holdings (s. f.). </w:t>
+        <w:t xml:space="preserve">Acorn Holdings. (s. f.). </w:t>
       </w:r>
       <w:r>
         <w:rPr>
           <w:i/>
-          <w:sz w:val="21"/>
+          <w:sz w:val="22"/>
         </w:rPr>
         <w:t>Overview</w:t>
       </w:r>
       <w:r>
         <w:rPr>
-          <w:sz w:val="21"/>
+          <w:i w:val="0"/>
+          <w:sz w:val="22"/>
         </w:rPr>
         <w:t>. Recuperado el 21 de octubre de 2026, de https://acornholdingsafrica.com/overview/</w:t>
       </w:r>
     </w:p>
     <w:p>
       <w:pPr>
-        <w:keepLines/>
-        <w:spacing w:line="288" w:lineRule="auto"/>
+        <w:spacing w:line="480" w:lineRule="auto" w:before="0" w:after="0"/>
         <w:ind w:left="720" w:hanging="720"/>
       </w:pPr>
       <w:r>
         <w:rPr>
-          <w:sz w:val="21"/>
+          <w:i w:val="0"/>
+          <w:sz w:val="22"/>
         </w:rPr>
-        <w:t xml:space="preserve">Banco Mundial (2020). </w:t>
+        <w:t xml:space="preserve">Banco Mundial. (2020). </w:t>
       </w:r>
       <w:r>
         <w:rPr>
           <w:i/>
-          <w:sz w:val="21"/>
+          <w:sz w:val="22"/>
         </w:rPr>
         <w:t>Kenya systematic country diagnostic</w:t>
       </w:r>
       <w:r>
         <w:rPr>
-          <w:sz w:val="21"/>
+          <w:i w:val="0"/>
+          <w:sz w:val="22"/>
         </w:rPr>
         <w:t>. https://documents1.worldbank.org/curated/en/531731600090213005/pdf/kenya-systematic-country-diagnostic.pdf</w:t>
       </w:r>
     </w:p>
     <w:p>
       <w:pPr>
-        <w:keepLines/>
-        <w:spacing w:line="288" w:lineRule="auto"/>
+        <w:spacing w:line="480" w:lineRule="auto" w:before="0" w:after="0"/>
         <w:ind w:left="720" w:hanging="720"/>
       </w:pPr>
       <w:r>
         <w:rPr>
-          <w:sz w:val="21"/>
+          <w:i w:val="0"/>
+          <w:sz w:val="22"/>
         </w:rPr>
-        <w:t xml:space="preserve">Banco Mundial (2024, 10 de diciembre). </w:t>
+        <w:t xml:space="preserve">Banco Mundial. (2024, 10 de diciembre). </w:t>
       </w:r>
       <w:r>
         <w:rPr>
           <w:i/>
-          <w:sz w:val="21"/>
+          <w:sz w:val="22"/>
         </w:rPr>
         <w:t>Reforms are needed to stem a slow-down in Kenya’s economic growth</w:t>
       </w:r>
       <w:r>
         <w:rPr>
-          <w:sz w:val="21"/>
+          <w:i w:val="0"/>
+          <w:sz w:val="22"/>
         </w:rPr>
         <w:t>. https://www.worldbank.org/en/news/press-release/2024/12/10/reforms-are-needed-to-stem-a-slow-down-in-afe-kenya-s-economic-growth</w:t>
       </w:r>
     </w:p>
     <w:p>
       <w:pPr>
-        <w:keepLines/>
-        <w:spacing w:line="288" w:lineRule="auto"/>
+        <w:spacing w:line="480" w:lineRule="auto" w:before="0" w:after="0"/>
         <w:ind w:left="720" w:hanging="720"/>
       </w:pPr>
       <w:r>
         <w:rPr>
-          <w:sz w:val="21"/>
+          <w:i w:val="0"/>
+          <w:sz w:val="22"/>
         </w:rPr>
-        <w:t xml:space="preserve">Banco Mundial (2025). </w:t>
+        <w:t xml:space="preserve">Banco Mundial. (2025). </w:t>
       </w:r>
       <w:r>
         <w:rPr>
           <w:i/>
-          <w:sz w:val="21"/>
+          <w:sz w:val="22"/>
         </w:rPr>
         <w:t>Kenya economic update 32: From barriers to bridges—Procompetitive reforms for productivity and jobs in Kenya</w:t>
       </w:r>
       <w:r>
         <w:rPr>
-          <w:sz w:val="21"/>
+          <w:i w:val="0"/>
+          <w:sz w:val="22"/>
         </w:rPr>
         <w:t>. https://documents1.worldbank.org/curated/en/099112125062524216/pdf/P507067-4f692fc7-8081-4630-9dd2-d3768ce9defc.pdf</w:t>
       </w:r>
     </w:p>
     <w:p>
       <w:pPr>
-        <w:keepLines/>
-        <w:spacing w:line="288" w:lineRule="auto"/>
+        <w:spacing w:line="480" w:lineRule="auto" w:before="0" w:after="0"/>
         <w:ind w:left="720" w:hanging="720"/>
       </w:pPr>
       <w:r>
         <w:rPr>
-          <w:sz w:val="21"/>
+          <w:i w:val="0"/>
+          <w:sz w:val="22"/>
         </w:rPr>
-        <w:t xml:space="preserve">Central Bank of Kenya (s. f.). </w:t>
+        <w:t xml:space="preserve">Central Bank of Kenya. (s. f.). </w:t>
       </w:r>
       <w:r>
         <w:rPr>
           <w:i/>
-          <w:sz w:val="21"/>
+          <w:sz w:val="22"/>
         </w:rPr>
         <w:t>Annual GDP</w:t>
       </w:r>
       <w:r>
         <w:rPr>
-          <w:sz w:val="21"/>
+          <w:i w:val="0"/>
+          <w:sz w:val="22"/>
         </w:rPr>
         <w:t>. Recuperado el 21 de octubre de 2026, de https://www.centralbank.go.ke/annual-gdp/</w:t>
       </w:r>
     </w:p>
     <w:p>
       <w:pPr>
-        <w:keepLines/>
-        <w:spacing w:line="288" w:lineRule="auto"/>
+        <w:spacing w:line="480" w:lineRule="auto" w:before="0" w:after="0"/>
         <w:ind w:left="720" w:hanging="720"/>
       </w:pPr>
       <w:r>
         <w:rPr>
-          <w:sz w:val="21"/>
+          <w:i w:val="0"/>
+          <w:sz w:val="22"/>
         </w:rPr>
         <w:t xml:space="preserve">Centric Africa Ltd. (2025). </w:t>
       </w:r>
       <w:r>
         <w:rPr>
           <w:i/>
-          <w:sz w:val="21"/>
+          <w:sz w:val="22"/>
         </w:rPr>
         <w:t>Environmental and social impact assessment study report for the proposed Riruta Keza IHS housing developments</w:t>
       </w:r>
       <w:r>
         <w:rPr>
-          <w:sz w:val="21"/>
+          <w:i w:val="0"/>
+          <w:sz w:val="22"/>
         </w:rPr>
         <w:t>. National Environment Management Authority. https://nema.go.ke/wp-content/uploads/2025/12/IHS-Riruta-Housing_00288-min.pdf</w:t>
       </w:r>
     </w:p>
     <w:p>
       <w:pPr>
-        <w:keepLines/>
-        <w:spacing w:line="288" w:lineRule="auto"/>
+        <w:spacing w:line="480" w:lineRule="auto" w:before="0" w:after="0"/>
         <w:ind w:left="720" w:hanging="720"/>
       </w:pPr>
       <w:r>
         <w:rPr>
-          <w:i/>
-          <w:sz w:val="21"/>
+          <w:i w:val="0"/>
+          <w:sz w:val="22"/>
         </w:rPr>
-        <w:t>Constitution of Kenya</w:t>
-      </w:r>
-      <w:r>
-        <w:rPr>
-          <w:sz w:val="21"/>
-        </w:rPr>
-        <w:t>, art. 65 (2010). Kenya Law Reform Commission. https://www.klrc.go.ke/index.php/constitution-of-kenya/116-chapter-five-land-and-environment/117-part-1-land/232-65-landholding-by-non-citizens</w:t>
+        <w:t>Constitution of Kenya, art. 65 (2010). Kenya Law Reform Commission. https://www.klrc.go.ke/index.php/constitution-of-kenya/116-chapter-five-land-and-environment/117-part-1-land/232-65-landholding-by-non-citizens</w:t>
       </w:r>
     </w:p>
     <w:p>
       <w:pPr>
-        <w:keepLines/>
-        <w:spacing w:line="288" w:lineRule="auto"/>
+        <w:spacing w:line="480" w:lineRule="auto" w:before="0" w:after="0"/>
         <w:ind w:left="720" w:hanging="720"/>
       </w:pPr>
       <w:r>
         <w:rPr>
-          <w:sz w:val="21"/>
+          <w:i w:val="0"/>
+          <w:sz w:val="22"/>
         </w:rPr>
-        <w:t xml:space="preserve">East African Community (s. f.). </w:t>
+        <w:t xml:space="preserve">East African Community. (s. f.). </w:t>
       </w:r>
       <w:r>
         <w:rPr>
           <w:i/>
-          <w:sz w:val="21"/>
+          <w:sz w:val="22"/>
         </w:rPr>
         <w:t>EAC at a glance</w:t>
       </w:r>
       <w:r>
         <w:rPr>
-          <w:sz w:val="21"/>
+          <w:i w:val="0"/>
+          <w:sz w:val="22"/>
         </w:rPr>
         <w:t>. Recuperado el 21 de octubre de 2026, de https://www.eac.int/component/content/?Itemid=89</w:t>
       </w:r>
     </w:p>
     <w:p>
       <w:pPr>
-        <w:keepLines/>
-        <w:spacing w:line="288" w:lineRule="auto"/>
+        <w:spacing w:line="480" w:lineRule="auto" w:before="0" w:after="0"/>
         <w:ind w:left="720" w:hanging="720"/>
       </w:pPr>
       <w:r>
         <w:rPr>
-          <w:sz w:val="21"/>
+          <w:i w:val="0"/>
+          <w:sz w:val="22"/>
         </w:rPr>
-        <w:t xml:space="preserve">Freedom House (2026). </w:t>
+        <w:t xml:space="preserve">Freedom House. (2026). </w:t>
       </w:r>
       <w:r>
         <w:rPr>
           <w:i/>
-          <w:sz w:val="21"/>
+          <w:sz w:val="22"/>
         </w:rPr>
         <w:t>Freedom in the world 2026: Kenya</w:t>
       </w:r>
       <w:r>
         <w:rPr>
-          <w:sz w:val="21"/>
+          <w:i w:val="0"/>
+          <w:sz w:val="22"/>
         </w:rPr>
         <w:t>. https://freedomhouse.org/country/kenya/freedom-world/2026</w:t>
       </w:r>
     </w:p>
     <w:p>
       <w:pPr>
-        <w:keepLines/>
-        <w:spacing w:line="288" w:lineRule="auto"/>
+        <w:spacing w:line="480" w:lineRule="auto" w:before="0" w:after="0"/>
         <w:ind w:left="720" w:hanging="720"/>
       </w:pPr>
       <w:r>
         <w:rPr>
-          <w:sz w:val="21"/>
+          <w:i w:val="0"/>
+          <w:sz w:val="22"/>
         </w:rPr>
         <w:t xml:space="preserve">Gamba, P., &amp; Kibaara, B. (2007). </w:t>
       </w:r>
       <w:r>
         <w:rPr>
           <w:i/>
-          <w:sz w:val="21"/>
+          <w:sz w:val="22"/>
         </w:rPr>
         <w:t>Structural implications of economic liberalization on agriculture and rural development: RuralStruc program, phase I</w:t>
       </w:r>
       <w:r>
         <w:rPr>
-          <w:sz w:val="21"/>
+          <w:i w:val="0"/>
+          <w:sz w:val="22"/>
         </w:rPr>
         <w:t>. Egerton University, Tegemeo Institute. https://documents1.worldbank.org/curated/en/886221468048846460/pdf/779820WP0KENYA00Box377319B00PUBLIC0.pdf</w:t>
       </w:r>
     </w:p>
     <w:p>
       <w:pPr>
-        <w:keepLines/>
-        <w:spacing w:line="288" w:lineRule="auto"/>
+        <w:spacing w:line="480" w:lineRule="auto" w:before="0" w:after="0"/>
         <w:ind w:left="720" w:hanging="720"/>
       </w:pPr>
       <w:r>
         <w:rPr>
-          <w:sz w:val="21"/>
+          <w:i w:val="0"/>
+          <w:sz w:val="22"/>
         </w:rPr>
-        <w:t xml:space="preserve">International Finance Corporation (2024). </w:t>
+        <w:t xml:space="preserve">International Finance Corporation. (2024). </w:t>
       </w:r>
       <w:r>
         <w:rPr>
           <w:i/>
-          <w:sz w:val="21"/>
+          <w:sz w:val="22"/>
         </w:rPr>
         <w:t>IHS Kenya: Environmental and social review summary (Project 47136)</w:t>
       </w:r>
       <w:r>
         <w:rPr>
-          <w:sz w:val="21"/>
+          <w:i w:val="0"/>
+          <w:sz w:val="22"/>
         </w:rPr>
         <w:t>. https://disclosures.ifc.org/project-detail/ESRS/47136/co</w:t>
       </w:r>
     </w:p>
     <w:p>
       <w:pPr>
-        <w:keepLines/>
-        <w:spacing w:line="288" w:lineRule="auto"/>
+        <w:spacing w:line="480" w:lineRule="auto" w:before="0" w:after="0"/>
         <w:ind w:left="720" w:hanging="720"/>
       </w:pPr>
       <w:r>
         <w:rPr>
-          <w:sz w:val="21"/>
+          <w:i w:val="0"/>
+          <w:sz w:val="22"/>
         </w:rPr>
-        <w:t xml:space="preserve">Kenya National Bureau of Statistics (2025). </w:t>
+        <w:t xml:space="preserve">Kenya National Bureau of Statistics. (2025). </w:t>
       </w:r>
       <w:r>
         <w:rPr>
           <w:i/>
-          <w:sz w:val="21"/>
+          <w:sz w:val="22"/>
         </w:rPr>
-        <w:t>Gross County Product 2025</w:t>
+        <w:t>Gross county product 2025</w:t>
       </w:r>
       <w:r>
         <w:rPr>
-          <w:sz w:val="21"/>
+          <w:i w:val="0"/>
+          <w:sz w:val="22"/>
         </w:rPr>
         <w:t>. https://www.knbs.or.ke/wp-content/uploads/2025/12/2025-Gross-County-Product.pdf</w:t>
       </w:r>
     </w:p>
     <w:p>
       <w:pPr>
-        <w:keepLines/>
-        <w:spacing w:line="288" w:lineRule="auto"/>
+        <w:spacing w:line="480" w:lineRule="auto" w:before="0" w:after="0"/>
         <w:ind w:left="720" w:hanging="720"/>
       </w:pPr>
       <w:r>
         <w:rPr>
-          <w:sz w:val="21"/>
+          <w:i w:val="0"/>
+          <w:sz w:val="22"/>
         </w:rPr>
-        <w:t xml:space="preserve">Kenya National Bureau of Statistics (2026). </w:t>
+        <w:t xml:space="preserve">Kenya National Bureau of Statistics. (2026). </w:t>
       </w:r>
       <w:r>
         <w:rPr>
           <w:i/>
-          <w:sz w:val="21"/>
+          <w:sz w:val="22"/>
         </w:rPr>
-        <w:t>Economic Survey 2026</w:t>
+        <w:t>Economic survey 2026</w:t>
       </w:r>
       <w:r>
         <w:rPr>
-          <w:sz w:val="21"/>
+          <w:i w:val="0"/>
+          <w:sz w:val="22"/>
         </w:rPr>
         <w:t>. https://www.knbs.or.ke/reports/2026-economic-survey/</w:t>
       </w:r>
     </w:p>
     <w:p>
       <w:pPr>
-        <w:keepLines/>
-        <w:spacing w:line="288" w:lineRule="auto"/>
+        <w:spacing w:line="480" w:lineRule="auto" w:before="0" w:after="0"/>
         <w:ind w:left="720" w:hanging="720"/>
       </w:pPr>
       <w:r>
         <w:rPr>
+          <w:i w:val="0"/>
+          <w:sz w:val="22"/>
+        </w:rPr>
+      </w:r>
+      <w:r>
+        <w:rPr>
           <w:i/>
-          <w:sz w:val="21"/>
+          <w:sz w:val="22"/>
         </w:rPr>
         <w:t>Kenya national human development report 2006: Human security and human development—A deliberate choice</w:t>
       </w:r>
       <w:r>
         <w:rPr>
-          <w:sz w:val="21"/>
+          <w:i w:val="0"/>
+          <w:sz w:val="22"/>
         </w:rPr>
         <w:t>. (2006). https://hdr.undp.org/system/files/documents/kenya2006en.pdf</w:t>
       </w:r>
     </w:p>
     <w:p>
       <w:pPr>
-        <w:keepLines/>
-        <w:spacing w:line="288" w:lineRule="auto"/>
+        <w:spacing w:line="480" w:lineRule="auto" w:before="0" w:after="0"/>
         <w:ind w:left="720" w:hanging="720"/>
       </w:pPr>
       <w:r>
         <w:rPr>
-          <w:sz w:val="21"/>
+          <w:i w:val="0"/>
+          <w:sz w:val="22"/>
         </w:rPr>
-        <w:t xml:space="preserve">Nairobi City County Government (2025, junio). </w:t>
+        <w:t xml:space="preserve">Nairobi City County Government. (2025, junio). </w:t>
       </w:r>
       <w:r>
         <w:rPr>
           <w:i/>
-          <w:sz w:val="21"/>
+          <w:sz w:val="22"/>
         </w:rPr>
         <w:t>Customer service charter</w:t>
       </w:r>
       <w:r>
         <w:rPr>
-          <w:sz w:val="21"/>
+          <w:i w:val="0"/>
+          <w:sz w:val="22"/>
         </w:rPr>
         <w:t>. https://nairobi.go.ke/wp-content/uploads/NCCG_Service_Charter_2025.pdf</w:t>
       </w:r>
     </w:p>
     <w:p>
       <w:pPr>
-        <w:keepLines/>
-        <w:spacing w:line="288" w:lineRule="auto"/>
+        <w:spacing w:line="480" w:lineRule="auto" w:before="0" w:after="0"/>
         <w:ind w:left="720" w:hanging="720"/>
       </w:pPr>
       <w:r>
         <w:rPr>
-          <w:sz w:val="21"/>
+          <w:i w:val="0"/>
+          <w:sz w:val="22"/>
         </w:rPr>
-        <w:t xml:space="preserve">National Council for Population and Development (2025, 12 de marzo). </w:t>
+        <w:t xml:space="preserve">National Council for Population and Development. (2025, 12 de marzo). </w:t>
       </w:r>
       <w:r>
         <w:rPr>
           <w:i/>
-          <w:sz w:val="21"/>
+          <w:sz w:val="22"/>
         </w:rPr>
         <w:t>Press release</w:t>
       </w:r>
       <w:r>
         <w:rPr>
-          <w:sz w:val="21"/>
+          <w:i w:val="0"/>
+          <w:sz w:val="22"/>
         </w:rPr>
         <w:t>. https://ncpd.go.ke/2025/03/12/press-release/</w:t>
       </w:r>
     </w:p>
     <w:p>
       <w:pPr>
-        <w:keepLines/>
-        <w:spacing w:line="288" w:lineRule="auto"/>
+        <w:spacing w:line="480" w:lineRule="auto" w:before="0" w:after="0"/>
         <w:ind w:left="720" w:hanging="720"/>
       </w:pPr>
       <w:r>
         <w:rPr>
-          <w:sz w:val="21"/>
+          <w:i w:val="0"/>
+          <w:sz w:val="22"/>
         </w:rPr>
-        <w:t xml:space="preserve">Private Infrastructure Development Group (2025, 17 de noviembre). </w:t>
+        <w:t xml:space="preserve">The National Treasury. (2025). </w:t>
       </w:r>
       <w:r>
         <w:rPr>
           <w:i/>
-          <w:sz w:val="21"/>
+          <w:sz w:val="22"/>
+        </w:rPr>
+        <w:t>Budget review and outlook paper</w:t>
+      </w:r>
+      <w:r>
+        <w:rPr>
+          <w:i w:val="0"/>
+          <w:sz w:val="22"/>
+        </w:rPr>
+        <w:t>. https://www.treasury.go.ke/wp-content/uploads/2025/10/2025-Budget-Review-and-Outlook-Paper.pdf</w:t>
+      </w:r>
+    </w:p>
+    <w:p>
+      <w:pPr>
+        <w:spacing w:line="480" w:lineRule="auto" w:before="0" w:after="0"/>
+        <w:ind w:left="720" w:hanging="720"/>
+      </w:pPr>
+      <w:r>
+        <w:rPr>
+          <w:i w:val="0"/>
+          <w:sz w:val="22"/>
+        </w:rPr>
+        <w:t xml:space="preserve">Private Infrastructure Development Group. (2025, 17 de noviembre). </w:t>
+      </w:r>
+      <w:r>
+        <w:rPr>
+          <w:i/>
+          <w:sz w:val="22"/>
         </w:rPr>
         <w:t>PIDG anchors Acorn’s new REIT to finance affordable housing for Kenya’s young urbanites</w:t>
       </w:r>
       <w:r>
         <w:rPr>
-          <w:sz w:val="21"/>
+          <w:i w:val="0"/>
+          <w:sz w:val="22"/>
         </w:rPr>
         <w:t>. https://pidg.org/pidg-anchors-acorns-new-reit-to-finance-affordable-housing-for-kenyas-young-urbanites/</w:t>
       </w:r>
     </w:p>
     <w:p>
       <w:pPr>
-        <w:keepLines/>
-        <w:spacing w:line="288" w:lineRule="auto"/>
+        <w:spacing w:line="480" w:lineRule="auto" w:before="0" w:after="0"/>
         <w:ind w:left="720" w:hanging="720"/>
       </w:pPr>
       <w:r>
         <w:rPr>
-          <w:sz w:val="21"/>
+          <w:i w:val="0"/>
+          <w:sz w:val="22"/>
         </w:rPr>
         <w:t xml:space="preserve">Robinson, H. J., Mwangi, B., &amp; Atkinson, B. (2025, 24 de febrero). </w:t>
       </w:r>
       <w:r>
         <w:rPr>
           <w:i/>
-          <w:sz w:val="21"/>
+          <w:sz w:val="22"/>
         </w:rPr>
         <w:t>Understanding the tenants of Fusion Capital’s rental properties in Nairobi, Kenya</w:t>
       </w:r>
       <w:r>
         <w:rPr>
-          <w:sz w:val="21"/>
+          <w:i w:val="0"/>
+          <w:sz w:val="22"/>
         </w:rPr>
         <w:t>. Reall. https://reall.net/blog/understanding-the-tenants-of-fusion-capitals-rental-properties-in-nairobi-kenya/</w:t>
       </w:r>
     </w:p>
     <w:p>
       <w:pPr>
-        <w:keepLines/>
-        <w:spacing w:line="288" w:lineRule="auto"/>
+        <w:spacing w:line="480" w:lineRule="auto" w:before="0" w:after="0"/>
         <w:ind w:left="720" w:hanging="720"/>
       </w:pPr>
       <w:r>
         <w:rPr>
-          <w:sz w:val="21"/>
+          <w:i w:val="0"/>
+          <w:sz w:val="22"/>
         </w:rPr>
-        <w:t xml:space="preserve">Shah, S., Zamara, &amp; Centre for Affordable Housing Finance in Africa (2026, 19 de mayo). </w:t>
+        <w:t xml:space="preserve">Shah, S., Zamara, &amp; Centre for Affordable Housing Finance in Africa. (2026, 19 de mayo). </w:t>
       </w:r>
       <w:r>
         <w:rPr>
           <w:i/>
-          <w:sz w:val="21"/>
+          <w:sz w:val="22"/>
         </w:rPr>
         <w:t>Affordable housing access for Kenya’s formal workforce: What pension data reveals and what can work</w:t>
       </w:r>
       <w:r>
         <w:rPr>
-          <w:sz w:val="21"/>
+          <w:i w:val="0"/>
+          <w:sz w:val="22"/>
         </w:rPr>
         <w:t>. FSD Kenya. https://www.fsdkenya.org/blogs-publications/publications/affordable-housing-access-for-kenyas-formal-workforce-what-pension-data-reveals-and-what-can-work/</w:t>
       </w:r>
     </w:p>
     <w:p>
       <w:pPr>
-        <w:keepLines/>
-        <w:spacing w:line="288" w:lineRule="auto"/>
+        <w:spacing w:line="480" w:lineRule="auto" w:before="0" w:after="0"/>
         <w:ind w:left="720" w:hanging="720"/>
       </w:pPr>
       <w:r>
         <w:rPr>
-          <w:sz w:val="21"/>
+          <w:i w:val="0"/>
+          <w:sz w:val="22"/>
         </w:rPr>
-        <w:t xml:space="preserve">The National Treasury (2025). </w:t>
+        <w:t xml:space="preserve">United Nations Conference on Trade and Development. (2025a). </w:t>
       </w:r>
       <w:r>
         <w:rPr>
           <w:i/>
-          <w:sz w:val="21"/>
-        </w:rPr>
-        <w:t>Budget review and outlook paper</w:t>
-      </w:r>
-      <w:r>
-        <w:rPr>
-          <w:sz w:val="21"/>
-        </w:rPr>
-        <w:t>. https://www.treasury.go.ke/wp-content/uploads/2025/10/2025-Budget-Review-and-Outlook-Paper.pdf</w:t>
-      </w:r>
-    </w:p>
-    <w:p>
-      <w:pPr>
-        <w:keepLines/>
-        <w:spacing w:line="288" w:lineRule="auto"/>
-        <w:ind w:left="720" w:hanging="720"/>
-      </w:pPr>
-      <w:r>
-        <w:rPr>
-          <w:sz w:val="21"/>
-        </w:rPr>
-        <w:t xml:space="preserve">UNCTAD (2025a). </w:t>
-      </w:r>
-      <w:r>
-        <w:rPr>
-          <w:i/>
-          <w:sz w:val="21"/>
+          <w:sz w:val="22"/>
         </w:rPr>
         <w:t>COMESA investment report 2025: Investment trends and policy insights</w:t>
       </w:r>
       <w:r>
         <w:rPr>
-          <w:sz w:val="21"/>
+          <w:i w:val="0"/>
+          <w:sz w:val="22"/>
         </w:rPr>
         <w:t>. https://unctad.org/system/files/official-document/diae2025d2_en.pdf</w:t>
       </w:r>
     </w:p>
     <w:p>
       <w:pPr>
-        <w:keepLines/>
-        <w:spacing w:line="288" w:lineRule="auto"/>
+        <w:spacing w:line="480" w:lineRule="auto" w:before="0" w:after="0"/>
         <w:ind w:left="720" w:hanging="720"/>
       </w:pPr>
       <w:r>
         <w:rPr>
-          <w:sz w:val="21"/>
+          <w:i w:val="0"/>
+          <w:sz w:val="22"/>
         </w:rPr>
-        <w:t xml:space="preserve">UNCTAD (2025b). </w:t>
+        <w:t xml:space="preserve">United Nations Conference on Trade and Development. (2025b). </w:t>
       </w:r>
       <w:r>
         <w:rPr>
           <w:i/>
-          <w:sz w:val="21"/>
+          <w:sz w:val="22"/>
         </w:rPr>
         <w:t>World investment report 2025: Country fact sheet—Kenya</w:t>
       </w:r>
       <w:r>
         <w:rPr>
-          <w:sz w:val="21"/>
+          <w:i w:val="0"/>
+          <w:sz w:val="22"/>
         </w:rPr>
         <w:t>. https://unctad.org/system/files/non-official-document/wir_fs_ke_en.pdf</w:t>
       </w:r>

</xml_diff>

<commit_message>
Sustituye las siglas KNBS por citas completas de autor y año
</commit_message>
<xml_diff>
--- a/trabajo_africa/documentos/Trabajo_Kenia_Cristina_Moro_APA.docx
+++ b/trabajo_africa/documentos/Trabajo_Kenia_Cristina_Moro_APA.docx
@@ -41,27 +41,12 @@
     </w:p>
     <w:p>
       <w:r>
-        <w:t>Kenia es un mercado de 53,3 millones de habitantes según la proyección nacional para 2025, recogida por KNBS y el Consejo Nacional de Población y Desarrollo. Se utiliza la serie demográfica nacional (Kenya National Bureau of Statistics, 2026; National Council for Population and Development, 2025). El PIB nominal alcanzó aproximadamente 17,58 billones de chelines en 2025 (Central Bank of Kenya, s. f.; Kenya National Bureau of Statistics, 2026). Esta cifra permite dimensionar la economía nacional. Para estimar la demanda de vivienda del proyecto, es necesario analizar los ingresos, gastos y necesidades de los hogares a los que se dirige.</w:t>
+        <w:t>Kenia es un mercado de 53,3 millones de habitantes según la proyección demográfica nacional para 2025 (Kenya National Bureau of Statistics, 2026; National Council for Population and Development, 2025). El PIB nominal alcanzó aproximadamente 17,58 billones de chelines en 2025 (Central Bank of Kenya, s. f.; Kenya National Bureau of Statistics, 2026). Esta cifra permite dimensionar la economía nacional. Para estimar la demanda de vivienda del proyecto, es necesario analizar los ingresos, gastos y necesidades de los hogares a los que se dirige.</w:t>
       </w:r>
     </w:p>
     <w:p>
       <w:r>
-        <w:rPr>
-          <w:i w:val="0"/>
-        </w:rPr>
-        <w:t xml:space="preserve">Según el </w:t>
-      </w:r>
-      <w:r>
-        <w:rPr>
-          <w:i/>
-        </w:rPr>
-        <w:t>Economic Survey 2026</w:t>
-      </w:r>
-      <w:r>
-        <w:rPr>
-          <w:i w:val="0"/>
-        </w:rPr>
-        <w:t xml:space="preserve"> de KNBS, el PIB real de Kenia creció un 4,6 % en 2025, frente al 4,7 % de 2024. El Banco Central de Kenia reproduce estas cifras en su serie de PIB anual (Central Bank of Kenya, s. f.; Kenya National Bureau of Statistics, 2026). Para valorar las implicaciones de este crecimiento sobre la demanda de alquiler en Nairobi, es necesario estudiar los ingresos y la estabilidad laboral de los hogares destinatarios.</w:t>
+        <w:t>El PIB real de Kenia creció un 4,6 % en 2025, frente al 4,7 % de 2024 (Kenya National Bureau of Statistics, 2026). El Banco Central de Kenia reproduce estas cifras en su serie de PIB anual (Central Bank of Kenya, s. f.; Kenya National Bureau of Statistics, 2026). Para valorar las implicaciones de este crecimiento sobre la demanda de alquiler en Nairobi, es necesario estudiar los ingresos y la estabilidad laboral de los hogares destinatarios.</w:t>
       </w:r>
     </w:p>
     <w:p>
@@ -71,7 +56,7 @@
     </w:p>
     <w:p>
       <w:r>
-        <w:t>Por lo tanto, se puede dilucidar que el mercado laboral limita el tamaño de la demanda solvente. La encuesta económica de KNBS muestra que la mayor parte del empleo creado en 2025 se concentró en el sector informal. La estadística excluye la pequeña agricultura rural y las actividades pastoriles y se refiere al país, no específicamente a Nairobi. Por ello, el crecimiento agregado resulta insuficiente para estimar la estabilidad de los ingresos de los futuros inquilinos (Kenya National Bureau of Statistics, 2026).</w:t>
+        <w:t>Por lo tanto, se puede dilucidar que el mercado laboral limita el tamaño de la demanda solvente. La mayor parte del empleo creado en 2025 se concentró en el sector informal (Kenya National Bureau of Statistics, 2026). La estadística excluye la pequeña agricultura rural y las actividades pastoriles y se refiere al país, no específicamente a Nairobi. Por ello, el crecimiento agregado resulta insuficiente para estimar la estabilidad de los ingresos de los futuros inquilinos (Kenya National Bureau of Statistics, 2026).</w:t>
       </w:r>
     </w:p>
     <w:p>
@@ -214,7 +199,7 @@
     </w:p>
     <w:p>
       <w:r>
-        <w:t>La pandemia mostró la vulnerabilidad de los ingresos y la diferencia entre actividad agregada y bienestar. La serie de KNBS publicada en 2026 y la tabla de PIB anual del CBK sitúan la contracción de 2020 en el 0,3 % y el rebote de 2021 en el 7,6 %. El repunte reflejó reapertura y recuperación sectorial, por lo que no debe extrapolarse como ritmo permanente (Central Bank of Kenya, s. f.; Kenya National Bureau of Statistics, 2026).</w:t>
+        <w:t>La pandemia mostró la vulnerabilidad de los ingresos y la diferencia entre actividad agregada y bienestar. El PIB real se contrajo un 0,3 % en 2020 y creció un 7,6 % en 2021 (Central Bank of Kenya, s. f.; Kenya National Bureau of Statistics, 2026). El repunte reflejó reapertura y recuperación sectorial, por lo que no debe extrapolarse como ritmo permanente (Central Bank of Kenya, s. f.; Kenya National Bureau of Statistics, 2026).</w:t>
       </w:r>
     </w:p>
     <w:p>

</xml_diff>

<commit_message>
Traslada el análisis de vivienda al plan de acción del apartado 6
</commit_message>
<xml_diff>
--- a/trabajo_africa/documentos/Trabajo_Kenia_Cristina_Moro_APA.docx
+++ b/trabajo_africa/documentos/Trabajo_Kenia_Cristina_Moro_APA.docx
@@ -28,7 +28,10 @@
     </w:p>
     <w:p>
       <w:r>
-        <w:t>Kenia alcanzó la independencia en 1963 con una economía y unas relaciones de acceso a la tierra marcadas por el dominio colonial. La expansión de la pequeña agricultura y la intervención pública dieron paso, desde los años ochenta, a reformas de liberalización y a una mayor participación privada (Gamba &amp; Kibaara, 2007). El crecimiento posterior de los servicios y la innovación ha convivido con diferencias de acceso al empleo y a las oportunidades. Este trabajo plantea que la construcción de vivienda para alquiler en Nairobi puede atraer inversión y mejorar las condiciones de vida de trabajadores, siempre que el producto sea compatible con sus ingresos y se apoye en suelo jurídicamente seguro, servicios adecuados y contratos previsibles. El marco de instituciones inclusivas y extractivas de Acemoglu y Robinson permitirá examinar quién accede a esas oportunidades y cómo se distribuyen los beneficios. Se elige Acorn Holdings como empresa principal y se compara con IHS y Fusion Capital.</w:t>
+        <w:rPr>
+          <w:i w:val="0"/>
+        </w:rPr>
+        <w:t>Kenia alcanzó la independencia en 1963 con una economía y unas relaciones de acceso a la tierra marcadas por el dominio colonial. La expansión de la pequeña agricultura y la intervención pública dieron paso, desde los años ochenta, a reformas de liberalización y a una mayor participación privada (Gamba &amp; Kibaara, 2007). El crecimiento posterior de los servicios y la innovación ha convivido con diferencias de acceso al empleo y a las oportunidades. El marco de instituciones inclusivas y extractivas de Acemoglu y Robinson permitirá examinar quién accede a esas oportunidades y cómo se distribuyen los beneficios.</w:t>
       </w:r>
     </w:p>
     <w:p>
@@ -46,27 +49,34 @@
     </w:p>
     <w:p>
       <w:r>
-        <w:t>El PIB real de Kenia creció un 4,6 % en 2025, frente al 4,7 % de 2024 (Kenya National Bureau of Statistics, 2026). El Banco Central de Kenia reproduce estas cifras en su serie de PIB anual (Central Bank of Kenya, s. f.; Kenya National Bureau of Statistics, 2026). Para valorar las implicaciones de este crecimiento sobre la demanda de alquiler en Nairobi, es necesario estudiar los ingresos y la estabilidad laboral de los hogares destinatarios.</w:t>
+        <w:rPr>
+          <w:i w:val="0"/>
+        </w:rPr>
+        <w:t>El PIB real de Kenia creció un 4,6 % en 2025, frente al 4,7 % de 2024 (Kenya National Bureau of Statistics, 2026). El Banco Central de Kenia reproduce estas cifras en su serie de PIB anual (Central Bank of Kenya, s. f.; Kenya National Bureau of Statistics, 2026).</w:t>
       </w:r>
     </w:p>
     <w:p>
       <w:r>
-        <w:t>El informe Gross County Product 2025 identifica a Nairobi como la ciudad-condado que más valor añadido genera en el país. Esta concentración de actividad justifica estudiar su mercado residencial. Para diseñar la promoción, sin embargo, es necesario identificar qué hogares podrían alquilarla y cómo accederían desde ella a sus centros de trabajo (Kenya National Bureau of Statistics, 2025).</w:t>
+        <w:rPr>
+          <w:i w:val="0"/>
+        </w:rPr>
+        <w:t>Nairobi es la ciudad-condado que más valor añadido genera en el país, lo que refleja la concentración territorial de actividad económica (Kenya National Bureau of Statistics, 2025).</w:t>
       </w:r>
     </w:p>
     <w:p>
       <w:r>
-        <w:t>Por lo tanto, se puede dilucidar que el mercado laboral limita el tamaño de la demanda solvente. La mayor parte del empleo creado en 2025 se concentró en el sector informal (Kenya National Bureau of Statistics, 2026). La estadística excluye la pequeña agricultura rural y las actividades pastoriles y se refiere al país, no específicamente a Nairobi. Por ello, el crecimiento agregado resulta insuficiente para estimar la estabilidad de los ingresos de los futuros inquilinos (Kenya National Bureau of Statistics, 2026).</w:t>
+        <w:rPr>
+          <w:i w:val="0"/>
+        </w:rPr>
+        <w:t>La mayor parte del empleo creado en 2025 se concentró en el sector informal. La estadística excluye la pequeña agricultura rural y las actividades pastoriles y se refiere al país, no específicamente a Nairobi (Kenya National Bureau of Statistics, 2026).</w:t>
       </w:r>
     </w:p>
     <w:p>
       <w:r>
-        <w:t>Para estudiar la capacidad de pago también hay que conocer los gastos y obligaciones del hogar. Se identifican restricciones de acceso a vivienda incluso entre personas vinculadas a fondos de pensiones (Shah et al., 2026). El cliente propuesto será, por ello, un hogar pequeño de trabajadores con ingresos documentables, sin presentar el proyecto como solución para toda la población de bajos ingresos.</w:t>
-      </w:r>
-    </w:p>
-    <w:p>
-      <w:r>
-        <w:t>La Comunidad de África Oriental reúne actualmente ocho Estados. Somalia se incorporó como miembro pleno en marzo de 2024. La EAC favorece un marco de cooperación económica cuya relación con el proyecto sería indirecta: actividad empresarial, inversión y movilidad. El mercado residencial de la promoción seguirá siendo local (East African Community, s. f.).</w:t>
+        <w:rPr>
+          <w:i w:val="0"/>
+        </w:rPr>
+        <w:t>La Comunidad de África Oriental reúne actualmente ocho Estados. Somalia se incorporó como miembro pleno en marzo de 2024. Este marco de cooperación económica ofrece posibilidades de actividad empresarial, inversión y movilidad (East African Community, s. f.).</w:t>
       </w:r>
     </w:p>
     <w:p>
@@ -79,32 +89,26 @@
     </w:p>
     <w:p>
       <w:r>
-        <w:t>La experiencia en servicios digitales ofrece herramientas para gestionar el alquiler. M-Pesa ilustra el uso de telefonía móvil para transferir dinero, aunque el acceso a estos servicios presenta desigualdades (Banco Mundial, 2020). Para un operador residencial, los pagos digitales pueden facilitar cobros y registros. Se trata de una posible mejora de gestión aunque la solvencia del inquilino dependerá de sus ingresos y obligaciones.</w:t>
+        <w:rPr>
+          <w:i w:val="0"/>
+        </w:rPr>
+        <w:t>M-Pesa ilustra el uso de telefonía móvil para transferir dinero, aunque el acceso a estos servicios presenta desigualdades (Banco Mundial, 2020).</w:t>
       </w:r>
     </w:p>
     <w:p>
       <w:r>
-        <w:t>Otro activo es la existencia de organizaciones capaces de desarrollar y gestionar vivienda con inversión institucional. Se describen actividades de desarrollo y adquisición de vivienda en Nairobi y otras zonas urbanas, con criterios de eficiencia de recursos y colaboración con promotores (International Finance Corporation, 2024). Este precedente muestra una vía para organizar capital destinado a vivienda. Una nueva operación necesitaría justificar su demanda, sus costes y la modalidad de tenencia.</w:t>
+        <w:rPr>
+          <w:i w:val="0"/>
+        </w:rPr>
+        <w:t>El contexto de inversión debe distinguir flujos anuales y capital acumulado. Las entradas de inversión extranjera directa en Kenia alcanzaron 1.503 millones de dólares en 2024, cifra redondeada a 1.500 millones en otra publicación del mismo organismo (United Nations Conference on Trade and Development [UNCTAD], 2025a, 2025b). Se trata de flujos nacionales.</w:t>
       </w:r>
     </w:p>
     <w:p>
       <w:r>
-        <w:t>El contexto de inversión debe distinguir flujos anuales y capital acumulado. Las entradas de inversión extranjera directa en Kenia alcanzaron 1.503 millones de dólares en 2024, cifra redondeada a 1.500 millones en otra publicación del mismo organismo (United Nations Conference on Trade and Development [UNCTAD], 2025a, 2025b). Se trata de flujos nacionales, no de recursos disponibles para vivienda.</w:t>
-      </w:r>
-    </w:p>
-    <w:p>
-      <w:r>
-        <w:t>La iniciativa de Acorn para ampliar el alquiler y el programa de International Housing Solutions muestran precedentes de organización institucional de capital (International Finance Corporation, 2024; Private Infrastructure Development Group, 2025). Su desarrollo es una oportunidad condicionada por demanda y ejecución, no una promesa automática de financiación del proyecto.</w:t>
-      </w:r>
-    </w:p>
-    <w:p>
-      <w:r>
-        <w:t>El suelo requiere un tratamiento institucional específico. La Constitución establece en su artículo 65 que las personas no ciudadanas pueden disponer de suelo mediante leasehold por un máximo de 99 años, y define cuándo una sociedad se considera ciudadana a estos efectos. Antes de adquirir la parcela habrá que comprobar el título, la duración del derecho y la estructura de propiedad de la sociedad inversora (Constitution of Kenya, 2010).</w:t>
-      </w:r>
-    </w:p>
-    <w:p>
-      <w:r>
-        <w:t>El funcionamiento de agua, saneamiento, electricidad y transporte condiciona el coste de residencia. Estas condiciones deben verificarse en la ubicación elegida: las capacidades nacionales no aseguran servicios suficientes para una parcela concreta. La evaluación del inmueble incluirá tanto su calidad constructiva como los gastos y las condiciones de uso para sus residentes.</w:t>
+        <w:rPr>
+          <w:i w:val="0"/>
+        </w:rPr>
+        <w:t>La Constitución establece en su artículo 65 que las personas no ciudadanas pueden disponer de suelo mediante leasehold por un máximo de 99 años, y define cuándo una sociedad se considera ciudadana a estos efectos (Constitution of Kenya, 2010).</w:t>
       </w:r>
     </w:p>
     <w:p>
@@ -164,14 +168,6 @@
       </w:r>
     </w:p>
     <w:p>
-      <w:r>
-        <w:rPr>
-          <w:i w:val="0"/>
-        </w:rPr>
-        <w:t>Esto ayuda a entender por qué el salario no basta para calcular cuánto alquiler puede pagar un hogar. Si una familia tiene que destinar más dinero a servicios esenciales, le queda menos para vivienda. Por ello, el proyecto deberá valorar tanto los ingresos como los gastos de sus futuros inquilinos.</w:t>
-      </w:r>
-    </w:p>
-    <w:p>
       <w:pPr>
         <w:pStyle w:val="Heading2"/>
       </w:pPr>
@@ -186,7 +182,10 @@
     </w:p>
     <w:p>
       <w:r>
-        <w:t>El desarrollo de pagos móviles añade una dimensión institucional: una innovación puede reducir obstáculos para operar en la economía. Sin embargo, extender los medios de pago no distribuye automáticamente la productividad ni elimina las diferencias territoriales. Para defender una inversión residencial se necesita comprobar que existen clientes capaces de mantener el alquiler, y que el proyecto no se limita a atender al segmento con mayores ingresos mientras se presenta como respuesta general al problema urbano.</w:t>
+        <w:rPr>
+          <w:i w:val="0"/>
+        </w:rPr>
+        <w:t>El desarrollo de pagos móviles añade una dimensión institucional: una innovación puede reducir obstáculos para operar en la economía. Sin embargo, extender los medios de pago no distribuye automáticamente la productividad ni elimina las diferencias territoriales.</w:t>
       </w:r>
     </w:p>
     <w:p>
@@ -204,12 +203,18 @@
     </w:p>
     <w:p>
       <w:r>
-        <w:t>Los shocks climáticos añaden otra limitación. El Economic Update de diciembre de 2024 señala que las inundaciones de ese año afectaron a medios de vida, especialmente urbanos, y limitaron el consumo. Para una promoción de alquiler, drenaje, exposición de la parcela y continuidad de servicios forman parte del análisis económico. Una vivienda físicamente disponible puede ser una mala solución si sus usuarios afrontan interrupciones o costes que no pueden asumir (Banco Mundial, 2024).</w:t>
+        <w:rPr>
+          <w:i w:val="0"/>
+        </w:rPr>
+        <w:t>Las inundaciones de 2024 afectaron a medios de vida, especialmente urbanos, y limitaron el consumo, lo que muestra la exposición de la economía a los shocks climáticos (Banco Mundial, 2024).</w:t>
       </w:r>
     </w:p>
     <w:p>
       <w:r>
-        <w:t>La situación fiscal exige prudencia con las propuestas públicas. El Budget Review and Outlook Paper de 2025 sitúa la deuda pública bruta en el 68,8 % del PIB para el ejercicio 2024/25, como resultado preliminar; el Economic Update del Banco Mundial de noviembre de 2025 recoge la misma ratio. Su implicación para el plan es evitar que la viabilidad dependa de incentivos fiscales amplios o de infraestructura pública cuya financiación no se haya identificado (Banco Mundial, 2025; The National Treasury, 2025).</w:t>
+        <w:rPr>
+          <w:i w:val="0"/>
+        </w:rPr>
+        <w:t>La situación fiscal exige prudencia con las propuestas públicas. El Budget Review and Outlook Paper de 2025 sitúa la deuda pública bruta en el 68,8 % del PIB para el ejercicio 2024/25, como resultado preliminar; el Economic Update del Banco Mundial de noviembre de 2025 recoge la misma ratio. Este endeudamiento limita el margen de actuación del sector público (Banco Mundial, 2025; The National Treasury, 2025).</w:t>
       </w:r>
     </w:p>
     <w:p>
@@ -341,12 +346,18 @@
     </w:p>
     <w:p>
       <w:r>
-        <w:t>Freedom House considera al país parcialmente libre en su edición de 2026 y describe elecciones competitivas junto con problemas de corrupción y actuación de las fuerzas de seguridad. Es una evaluación de derechos y libertades, no una medida directa del riesgo de una promoción ni un sustituto del análisis legal. Sirve para cuestionar la equivalencia entre dinamismo económico y calidad institucional (Freedom House, 2026).</w:t>
+        <w:rPr>
+          <w:i w:val="0"/>
+        </w:rPr>
+        <w:t>Freedom House considera al país parcialmente libre en su edición de 2026 y describe elecciones competitivas junto con problemas de corrupción y actuación de las fuerzas de seguridad. Es una evaluación de derechos y libertades. Sirve para cuestionar la equivalencia entre dinamismo económico y calidad institucional (Freedom House, 2026).</w:t>
       </w:r>
     </w:p>
     <w:p>
       <w:r>
-        <w:t>La aplicación al proyecto combina protección de la inversión y derechos del inquilino: revisión del suelo, contratación comprensible, competencia entre proveedores y publicidad de los cargos. Una operación que mejore edificios pero desplace a trabajadores o los obligue a un esfuerzo insostenible no demostraría inclusión. El DAFO recoge esa tensión entre capacidades empresariales y restricciones de ingresos, servicios y gobernanza.</w:t>
+        <w:rPr>
+          <w:i w:val="0"/>
+        </w:rPr>
+        <w:t>El DAFO recoge la tensión entre capacidades empresariales y restricciones de ingresos, servicios y gobernanza.</w:t>
       </w:r>
     </w:p>
     <w:p>
@@ -359,7 +370,10 @@
     </w:p>
     <w:p>
       <w:r>
-        <w:t>Este DAFO recoge el análisis previo sobre la economía de Kenia, sin aplicarlo al mercado del alquiler.</w:t>
+        <w:rPr>
+          <w:i w:val="0"/>
+        </w:rPr>
+        <w:t>Este DAFO recoge el análisis previo sobre la economía de Kenia.</w:t>
       </w:r>
     </w:p>
     <w:tbl>
@@ -743,7 +757,159 @@
         <w:pStyle w:val="Heading2"/>
       </w:pPr>
       <w:r>
-        <w:t>6.2. Empresas objetivo y elección de Acorn Holdings como cabecera</w:t>
+        <w:t>6.2. Fundamentos y condiciones del proyecto de vivienda</w:t>
+      </w:r>
+    </w:p>
+    <w:p>
+      <w:r>
+        <w:rPr>
+          <w:i w:val="0"/>
+        </w:rPr>
+        <w:t>Este trabajo plantea que la construcción de vivienda para alquiler en Nairobi puede atraer inversión y mejorar las condiciones de vida de trabajadores, siempre que el producto sea compatible con sus ingresos y se apoye en suelo jurídicamente seguro, servicios adecuados y contratos previsibles. Se elige Acorn Holdings como empresa principal y se compara con IHS y Fusion Capital.</w:t>
+      </w:r>
+    </w:p>
+    <w:p>
+      <w:r>
+        <w:rPr>
+          <w:i w:val="0"/>
+        </w:rPr>
+        <w:t>Para valorar las implicaciones de este crecimiento sobre la demanda de alquiler en Nairobi, es necesario estudiar los ingresos y la estabilidad laboral de los hogares destinatarios.</w:t>
+      </w:r>
+    </w:p>
+    <w:p>
+      <w:r>
+        <w:rPr>
+          <w:i w:val="0"/>
+        </w:rPr>
+        <w:t>La concentración de actividad en Nairobi justifica estudiar su mercado residencial. Para diseñar la promoción es necesario identificar qué hogares podrían alquilarla y cómo accederían desde ella a sus centros de trabajo (Kenya National Bureau of Statistics, 2025).</w:t>
+      </w:r>
+    </w:p>
+    <w:p>
+      <w:r>
+        <w:rPr>
+          <w:i w:val="0"/>
+        </w:rPr>
+        <w:t>El mercado laboral limita el tamaño de la demanda solvente. El crecimiento agregado resulta insuficiente para estimar la estabilidad de los ingresos de los futuros inquilinos (Kenya National Bureau of Statistics, 2026).</w:t>
+      </w:r>
+    </w:p>
+    <w:p>
+      <w:r>
+        <w:rPr>
+          <w:i w:val="0"/>
+        </w:rPr>
+        <w:t>Para estudiar la capacidad de pago también hay que conocer los gastos y obligaciones del hogar. Se identifican restricciones de acceso a vivienda incluso entre personas vinculadas a fondos de pensiones (Shah et al., 2026). El cliente propuesto será, por ello, un hogar pequeño de trabajadores con ingresos documentables, sin presentar el proyecto como solución para toda la población de bajos ingresos.</w:t>
+      </w:r>
+    </w:p>
+    <w:p>
+      <w:r>
+        <w:rPr>
+          <w:i w:val="0"/>
+        </w:rPr>
+        <w:t>La relación de la integración regional con el proyecto sería indirecta, a través de actividad empresarial, inversión y movilidad. El mercado residencial de la promoción seguirá siendo local.</w:t>
+      </w:r>
+    </w:p>
+    <w:p>
+      <w:r>
+        <w:rPr>
+          <w:i w:val="0"/>
+        </w:rPr>
+        <w:t>La experiencia en servicios digitales ofrece herramientas para gestionar el alquiler. Para un operador residencial, los pagos digitales pueden facilitar cobros y registros. Se trata de una posible mejora de gestión aunque la solvencia del inquilino dependerá de sus ingresos y obligaciones.</w:t>
+      </w:r>
+    </w:p>
+    <w:p>
+      <w:r>
+        <w:rPr>
+          <w:i w:val="0"/>
+        </w:rPr>
+        <w:t>Otro activo es la existencia de organizaciones capaces de desarrollar y gestionar vivienda con inversión institucional. Se describen actividades de desarrollo y adquisición de vivienda en Nairobi y otras zonas urbanas, con criterios de eficiencia de recursos y colaboración con promotores (International Finance Corporation, 2024). Este precedente muestra una vía para organizar capital destinado a vivienda. Una nueva operación necesitaría justificar su demanda, sus costes y la modalidad de tenencia.</w:t>
+      </w:r>
+    </w:p>
+    <w:p>
+      <w:r>
+        <w:rPr>
+          <w:i w:val="0"/>
+        </w:rPr>
+        <w:t>La iniciativa de Acorn para ampliar el alquiler y el programa de International Housing Solutions muestran precedentes de organización institucional de capital (International Finance Corporation, 2024; Private Infrastructure Development Group, 2025). Su desarrollo es una oportunidad condicionada por demanda y ejecución, no una promesa automática de financiación del proyecto.</w:t>
+      </w:r>
+    </w:p>
+    <w:p>
+      <w:r>
+        <w:rPr>
+          <w:i w:val="0"/>
+        </w:rPr>
+        <w:t>Las entradas nacionales de inversión extranjera directa no equivalen a recursos disponibles para financiar esta promoción.</w:t>
+      </w:r>
+    </w:p>
+    <w:p>
+      <w:r>
+        <w:rPr>
+          <w:i w:val="0"/>
+        </w:rPr>
+        <w:t>Antes de adquirir la parcela habrá que comprobar el título, la duración del derecho y la estructura de propiedad de la sociedad inversora (Constitution of Kenya, 2010).</w:t>
+      </w:r>
+    </w:p>
+    <w:p>
+      <w:r>
+        <w:rPr>
+          <w:i w:val="0"/>
+        </w:rPr>
+        <w:t>El funcionamiento de agua, saneamiento, electricidad y transporte condiciona el coste de residencia. Estas condiciones deben verificarse en la ubicación elegida: las capacidades nacionales no aseguran servicios suficientes para una parcela concreta. La evaluación del inmueble incluirá tanto su calidad constructiva como los gastos y las condiciones de uso para sus residentes.</w:t>
+      </w:r>
+    </w:p>
+    <w:p>
+      <w:r>
+        <w:rPr>
+          <w:i w:val="0"/>
+        </w:rPr>
+        <w:t>Esto ayuda a entender por qué el salario no basta para calcular cuánto alquiler puede pagar un hogar. Si una familia tiene que destinar más dinero a servicios esenciales, le queda menos para vivienda. Por ello, el proyecto deberá valorar tanto los ingresos como los gastos de sus futuros inquilinos.</w:t>
+      </w:r>
+    </w:p>
+    <w:p>
+      <w:r>
+        <w:rPr>
+          <w:i w:val="0"/>
+        </w:rPr>
+        <w:t>Para defender una inversión residencial se necesita comprobar que existen clientes capaces de mantener el alquiler, y que el proyecto no se limita a atender al segmento con mayores ingresos mientras se presenta como respuesta general al problema urbano.</w:t>
+      </w:r>
+    </w:p>
+    <w:p>
+      <w:r>
+        <w:rPr>
+          <w:i w:val="0"/>
+        </w:rPr>
+        <w:t>Para una promoción de alquiler, drenaje, exposición de la parcela y continuidad de servicios forman parte del análisis económico. Una vivienda físicamente disponible puede ser una mala solución si sus usuarios afrontan interrupciones o costes que no pueden asumir.</w:t>
+      </w:r>
+    </w:p>
+    <w:p>
+      <w:r>
+        <w:rPr>
+          <w:i w:val="0"/>
+        </w:rPr>
+        <w:t>Las restricciones fiscales aconsejan evitar que la viabilidad del proyecto dependa de incentivos fiscales amplios o de infraestructura pública cuya financiación no se haya identificado (Banco Mundial, 2025; The National Treasury, 2025).</w:t>
+      </w:r>
+    </w:p>
+    <w:p>
+      <w:r>
+        <w:rPr>
+          <w:i w:val="0"/>
+        </w:rPr>
+        <w:t>La evaluación de derechos y libertades no es una medida directa del riesgo de una promoción ni un sustituto del análisis legal (Freedom House, 2026).</w:t>
+      </w:r>
+    </w:p>
+    <w:p>
+      <w:r>
+        <w:rPr>
+          <w:i w:val="0"/>
+        </w:rPr>
+        <w:t>La aplicación al proyecto combina protección de la inversión y derechos del inquilino: revisión del suelo, contratación comprensible, competencia entre proveedores y publicidad de los cargos. Una operación que mejore edificios pero desplace a trabajadores o los obligue a un esfuerzo insostenible no demostraría inclusión.</w:t>
+      </w:r>
+    </w:p>
+    <w:p>
+      <w:pPr>
+        <w:pStyle w:val="Heading2"/>
+      </w:pPr>
+      <w:r>
+        <w:t>6.3. Empresas objetivo y elección de Acorn Holdings como cabecera</w:t>
       </w:r>
     </w:p>
     <w:p>
@@ -807,7 +973,7 @@
         <w:pStyle w:val="Heading2"/>
       </w:pPr>
       <w:r>
-        <w:t>6.3. Plan de acción 360º: medidas, responsables y plazos</w:t>
+        <w:t>6.4. Plan de acción 360º: medidas, responsables y plazos</w:t>
       </w:r>
     </w:p>
     <w:p>
@@ -1343,7 +1509,7 @@
         <w:pStyle w:val="Heading2"/>
       </w:pPr>
       <w:r>
-        <w:t>6.4. Decisión de inversión y seguimiento</w:t>
+        <w:t>6.5. Decisión de inversión y seguimiento</w:t>
       </w:r>
     </w:p>
     <w:p>

</xml_diff>

<commit_message>
Aplica el marco de Acemoglu y Robinson al análisis económico y residencial
</commit_message>
<xml_diff>
--- a/trabajo_africa/documentos/Trabajo_Kenia_Cristina_Moro_APA.docx
+++ b/trabajo_africa/documentos/Trabajo_Kenia_Cristina_Moro_APA.docx
@@ -73,6 +73,11 @@
     </w:p>
     <w:p>
       <w:r>
+        <w:t>El predominio del empleo informal entre los nuevos puestos de trabajo plantea una cuestión institucional: hasta qué punto las oportunidades de producir y trabajar van acompañadas de acceso a financiación, protección jurídica y protección social. Desde Acemoglu y Robinson (2012), el crecimiento es más inclusivo cuando amplía esas oportunidades a distintos grupos. El dato de informalidad muestra que crecimiento y formalización no avanzan necesariamente juntos, pero no identifica por sí solo qué barreras explican esa situación ni demuestra que toda actividad informal sea extractiva.</w:t>
+      </w:r>
+    </w:p>
+    <w:p>
+      <w:r>
         <w:rPr>
           <w:i w:val="0"/>
         </w:rPr>
@@ -138,6 +143,11 @@
       </w:r>
     </w:p>
     <w:p>
+      <w:r>
+        <w:t>Desde el marco de Acemoglu y Robinson (2012), la independencia debe analizarse también como una posible transformación de las reglas de acceso a la tierra y al poder. La expansión de pequeños productores descrita en el informe permite preguntar si más personas pudieron participar en la actividad económica o si persistieron ventajas para quienes ya controlaban los recursos. El cambio de soberanía no basta para demostrar inclusión: habría que comprobar cómo se distribuyeron los derechos y las oportunidades. La información reunida permite plantear esta interpretación, pero no medir cuánto poder conservaron los distintos grupos tras la independencia.</w:t>
+      </w:r>
+    </w:p>
+    <w:p>
       <w:pPr>
         <w:pStyle w:val="Heading2"/>
       </w:pPr>
@@ -168,6 +178,11 @@
       </w:r>
     </w:p>
     <w:p>
+      <w:r>
+        <w:t>Acemoglu y Robinson (2012) permiten distinguir entre aumentar la participación privada y ampliar la participación económica. Aplicado a las privatizaciones y la liberalización descritas, el criterio es si nuevos productores y empresas pudieron competir o si las oportunidades se concentraron en actores con recursos y contactos. Por eso, la valoración de las reformas debe combinar sus resultados económicos con el acceso a servicios y las posibilidades de entrada al mercado; privatizar, por sí solo, no demuestra que las instituciones sean inclusivas.</w:t>
+      </w:r>
+    </w:p>
+    <w:p>
       <w:pPr>
         <w:pStyle w:val="Heading2"/>
       </w:pPr>
@@ -186,6 +201,11 @@
           <w:i w:val="0"/>
         </w:rPr>
         <w:t>El desarrollo de pagos móviles añade una dimensión institucional: una innovación puede reducir obstáculos para operar en la economía. Sin embargo, extender los medios de pago no distribuye automáticamente la productividad ni elimina las diferencias territoriales.</w:t>
+      </w:r>
+    </w:p>
+    <w:p>
+      <w:r>
+        <w:t>El caso de M-Pesa puede interpretarse, desde Acemoglu y Robinson (2012), como una herramienta que reduce barreras para realizar transacciones y participar en la economía. Sin embargo, las desigualdades de acceso señaladas impiden equiparar innovación con inclusión generalizada. La pregunta institucional es quién puede utilizar esa herramienta y convertirla en oportunidades productivas, no únicamente cuánto crecen los servicios digitales.</w:t>
       </w:r>
     </w:p>
     <w:p>
@@ -350,6 +370,11 @@
           <w:i w:val="0"/>
         </w:rPr>
         <w:t>Freedom House considera al país parcialmente libre en su edición de 2026 y describe elecciones competitivas junto con problemas de corrupción y actuación de las fuerzas de seguridad. Es una evaluación de derechos y libertades. Sirve para cuestionar la equivalencia entre dinamismo económico y calidad institucional (Freedom House, 2026).</w:t>
+      </w:r>
+    </w:p>
+    <w:p>
+      <w:r>
+        <w:t>La concentración de valor añadido en Nairobi también invita a examinar la distribución territorial de las oportunidades. Desde Acemoglu y Robinson (2012), la descentralización del poder —devolution— puede ampliar la participación y la rendición de cuentas si facilita que la población controle las decisiones locales; también puede reproducir concentraciones de poder si las decisiones quedan en manos de grupos reducidos. Este es un criterio para evaluar la descentralización, no un resultado demostrado para Kenia: la concentración económica en la capital y la información institucional reunida no permiten concluir si la distribución territorial del poder ha reducido la captura de recursos o las desigualdades.</w:t>
       </w:r>
     </w:p>
     <w:p>
@@ -902,6 +927,11 @@
           <w:i w:val="0"/>
         </w:rPr>
         <w:t>La aplicación al proyecto combina protección de la inversión y derechos del inquilino: revisión del suelo, contratación comprensible, competencia entre proveedores y publicidad de los cargos. Una operación que mejore edificios pero desplace a trabajadores o los obligue a un esfuerzo insostenible no demostraría inclusión.</w:t>
+      </w:r>
+    </w:p>
+    <w:p>
+      <w:r>
+        <w:t>Aplicado a la vivienda, el marco de Acemoglu y Robinson (2012) exige distinguir la seguridad del inversor de la inclusión de los residentes. El límite de 99 años para determinados derechos sobre el suelo regula la posición de los inversores extranjeros, pero no demuestra que los hogares puedan acceder a suelo, crédito o servicios. Las restricciones de acceso a vivienda documentadas incluso entre personas vinculadas a fondos de pensiones refuerzan la necesidad de comprobar quién puede pagar el producto. Por ello, el proyecto deberá verificar contratos comprensibles, acceso efectivo a servicios y coste total de residencia, además del título de la parcela. La inclusión se evaluará por las oportunidades y condiciones de los trabajadores, no solo por el capital captado o el edificio construido.</w:t>
       </w:r>
     </w:p>
     <w:p>

</xml_diff>